<commit_message>
finished day 4 and 5
</commit_message>
<xml_diff>
--- a/Dokumentation-GymTrackerApp-Mattia-Tuor.docx
+++ b/Dokumentation-GymTrackerApp-Mattia-Tuor.docx
@@ -30,7 +30,7 @@
             <mc:AlternateContent>
               <mc:Choice Requires="wps">
                 <w:drawing>
-                  <wp:anchor distT="0" distB="0" distL="114300" distR="114300" simplePos="0" relativeHeight="251641344" behindDoc="0" locked="0" layoutInCell="1" allowOverlap="1" wp14:anchorId="0043533B" wp14:editId="74CC7DEF">
+                  <wp:anchor distT="0" distB="0" distL="114300" distR="114300" simplePos="0" relativeHeight="251638272" behindDoc="0" locked="0" layoutInCell="1" allowOverlap="1" wp14:anchorId="0043533B" wp14:editId="1106F1FE">
                     <wp:simplePos x="0" y="0"/>
                     <mc:AlternateContent>
                       <mc:Choice Requires="wp14">
@@ -167,7 +167,7 @@
               </mc:Choice>
               <mc:Fallback>
                 <w:pict>
-                  <v:rect w14:anchorId="0043533B" id="Rechteck 16" o:spid="_x0000_s1026" style="position:absolute;margin-left:0;margin-top:0;width:422.3pt;height:760.1pt;z-index:251641344;visibility:visible;mso-wrap-style:square;mso-width-percent:690;mso-height-percent:960;mso-left-percent:20;mso-top-percent:20;mso-wrap-distance-left:9pt;mso-wrap-distance-top:0;mso-wrap-distance-right:9pt;mso-wrap-distance-bottom:0;mso-position-horizontal-relative:page;mso-position-vertical-relative:page;mso-width-percent:690;mso-height-percent:960;mso-left-percent:20;mso-top-percent:20;mso-width-relative:page;mso-height-relative:page;v-text-anchor:middle" o:gfxdata="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" fillcolor="#156082 [3204]" stroked="f">
+                  <v:rect w14:anchorId="0043533B" id="Rechteck 16" o:spid="_x0000_s1026" style="position:absolute;margin-left:0;margin-top:0;width:422.3pt;height:760.1pt;z-index:251638272;visibility:visible;mso-wrap-style:square;mso-width-percent:690;mso-height-percent:960;mso-left-percent:20;mso-top-percent:20;mso-wrap-distance-left:9pt;mso-wrap-distance-top:0;mso-wrap-distance-right:9pt;mso-wrap-distance-bottom:0;mso-position-horizontal-relative:page;mso-position-vertical-relative:page;mso-width-percent:690;mso-height-percent:960;mso-left-percent:20;mso-top-percent:20;mso-width-relative:page;mso-height-relative:page;v-text-anchor:middle" o:gfxdata="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" fillcolor="#156082 [3204]" stroked="f">
                     <v:textbox inset="21.6pt,1in,21.6pt">
                       <w:txbxContent>
                         <w:sdt>
@@ -247,7 +247,7 @@
             <mc:AlternateContent>
               <mc:Choice Requires="wps">
                 <w:drawing>
-                  <wp:anchor distT="0" distB="0" distL="114300" distR="114300" simplePos="0" relativeHeight="251642368" behindDoc="0" locked="0" layoutInCell="1" allowOverlap="1" wp14:anchorId="7985761E" wp14:editId="640823D9">
+                  <wp:anchor distT="0" distB="0" distL="114300" distR="114300" simplePos="0" relativeHeight="251639296" behindDoc="0" locked="0" layoutInCell="1" allowOverlap="1" wp14:anchorId="7985761E" wp14:editId="527E63DB">
                     <wp:simplePos x="0" y="0"/>
                     <mc:AlternateContent>
                       <mc:Choice Requires="wp14">
@@ -362,7 +362,7 @@
               </mc:Choice>
               <mc:Fallback>
                 <w:pict>
-                  <v:rect w14:anchorId="7985761E" id="Rechteck 243" o:spid="_x0000_s1027" style="position:absolute;margin-left:0;margin-top:0;width:148.1pt;height:760.3pt;z-index:251642368;visibility:visible;mso-wrap-style:square;mso-width-percent:242;mso-height-percent:960;mso-left-percent:730;mso-wrap-distance-left:9pt;mso-wrap-distance-top:0;mso-wrap-distance-right:9pt;mso-wrap-distance-bottom:0;mso-position-horizontal-relative:page;mso-position-vertical:center;mso-position-vertical-relative:page;mso-width-percent:242;mso-height-percent:960;mso-left-percent:730;mso-width-relative:page;mso-height-relative:page;v-text-anchor:middle" o:gfxdata="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" fillcolor="#0e2841 [3215]" stroked="f" strokeweight="1.5pt">
+                  <v:rect w14:anchorId="7985761E" id="Rechteck 243" o:spid="_x0000_s1027" style="position:absolute;margin-left:0;margin-top:0;width:148.1pt;height:760.3pt;z-index:251639296;visibility:visible;mso-wrap-style:square;mso-width-percent:242;mso-height-percent:960;mso-left-percent:730;mso-wrap-distance-left:9pt;mso-wrap-distance-top:0;mso-wrap-distance-right:9pt;mso-wrap-distance-bottom:0;mso-position-horizontal-relative:page;mso-position-vertical:center;mso-position-vertical-relative:page;mso-width-percent:242;mso-height-percent:960;mso-left-percent:730;mso-width-relative:page;mso-height-relative:page;v-text-anchor:middle" o:gfxdata="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" fillcolor="#0e2841 [3215]" stroked="f" strokeweight="1.5pt">
                     <v:textbox inset="14.4pt,,14.4pt">
                       <w:txbxContent>
                         <w:sdt>
@@ -412,7 +412,7 @@
             <mc:AlternateContent>
               <mc:Choice Requires="wps">
                 <w:drawing>
-                  <wp:anchor distT="0" distB="0" distL="114300" distR="114300" simplePos="0" relativeHeight="251654144" behindDoc="0" locked="0" layoutInCell="1" allowOverlap="1" wp14:anchorId="68A152A8" wp14:editId="27541692">
+                  <wp:anchor distT="0" distB="0" distL="114300" distR="114300" simplePos="0" relativeHeight="251651072" behindDoc="0" locked="0" layoutInCell="1" allowOverlap="1" wp14:anchorId="68A152A8" wp14:editId="55C9A671">
                     <wp:simplePos x="0" y="0"/>
                     <wp:positionH relativeFrom="margin">
                       <wp:posOffset>-506913</wp:posOffset>
@@ -506,7 +506,27 @@
                                     <w:szCs w:val="28"/>
                                     <w:lang w:val="de-DE"/>
                                   </w:rPr>
-                                  <w:t>: Cistec AG</w:t>
+                                  <w:t xml:space="preserve">: </w:t>
+                                </w:r>
+                                <w:proofErr w:type="spellStart"/>
+                                <w:r>
+                                  <w:rPr>
+                                    <w:color w:val="FFFFFF" w:themeColor="background1"/>
+                                    <w:sz w:val="28"/>
+                                    <w:szCs w:val="28"/>
+                                    <w:lang w:val="de-DE"/>
+                                  </w:rPr>
+                                  <w:t>Cistec</w:t>
+                                </w:r>
+                                <w:proofErr w:type="spellEnd"/>
+                                <w:r>
+                                  <w:rPr>
+                                    <w:color w:val="FFFFFF" w:themeColor="background1"/>
+                                    <w:sz w:val="28"/>
+                                    <w:szCs w:val="28"/>
+                                    <w:lang w:val="de-DE"/>
+                                  </w:rPr>
+                                  <w:t xml:space="preserve"> AG</w:t>
                                 </w:r>
                               </w:p>
                               <w:p>
@@ -542,7 +562,7 @@
                     <v:stroke joinstyle="miter"/>
                     <v:path gradientshapeok="t" o:connecttype="rect"/>
                   </v:shapetype>
-                  <v:shape id="Textfeld 1" o:spid="_x0000_s1028" type="#_x0000_t202" style="position:absolute;margin-left:-39.9pt;margin-top:412.9pt;width:280.85pt;height:115.5pt;z-index:251654144;visibility:visible;mso-wrap-style:square;mso-width-percent:0;mso-wrap-distance-left:9pt;mso-wrap-distance-top:0;mso-wrap-distance-right:9pt;mso-wrap-distance-bottom:0;mso-position-horizontal:absolute;mso-position-horizontal-relative:margin;mso-position-vertical:absolute;mso-position-vertical-relative:text;mso-width-percent:0;mso-width-relative:margin;v-text-anchor:top" o:gfxdata="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" filled="f" stroked="f" strokeweight=".5pt">
+                  <v:shape id="Textfeld 1" o:spid="_x0000_s1028" type="#_x0000_t202" style="position:absolute;margin-left:-39.9pt;margin-top:412.9pt;width:280.85pt;height:115.5pt;z-index:251651072;visibility:visible;mso-wrap-style:square;mso-width-percent:0;mso-wrap-distance-left:9pt;mso-wrap-distance-top:0;mso-wrap-distance-right:9pt;mso-wrap-distance-bottom:0;mso-position-horizontal:absolute;mso-position-horizontal-relative:margin;mso-position-vertical:absolute;mso-position-vertical-relative:text;mso-width-percent:0;mso-width-relative:margin;v-text-anchor:top" o:gfxdata="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" filled="f" stroked="f" strokeweight=".5pt">
                     <v:textbox>
                       <w:txbxContent>
                         <w:p>
@@ -607,7 +627,27 @@
                               <w:szCs w:val="28"/>
                               <w:lang w:val="de-DE"/>
                             </w:rPr>
-                            <w:t>: Cistec AG</w:t>
+                            <w:t xml:space="preserve">: </w:t>
+                          </w:r>
+                          <w:proofErr w:type="spellStart"/>
+                          <w:r>
+                            <w:rPr>
+                              <w:color w:val="FFFFFF" w:themeColor="background1"/>
+                              <w:sz w:val="28"/>
+                              <w:szCs w:val="28"/>
+                              <w:lang w:val="de-DE"/>
+                            </w:rPr>
+                            <w:t>Cistec</w:t>
+                          </w:r>
+                          <w:proofErr w:type="spellEnd"/>
+                          <w:r>
+                            <w:rPr>
+                              <w:color w:val="FFFFFF" w:themeColor="background1"/>
+                              <w:sz w:val="28"/>
+                              <w:szCs w:val="28"/>
+                              <w:lang w:val="de-DE"/>
+                            </w:rPr>
+                            <w:t xml:space="preserve"> AG</w:t>
                           </w:r>
                         </w:p>
                         <w:p>
@@ -635,7 +675,7 @@
             <mc:AlternateContent>
               <mc:Choice Requires="wps">
                 <w:drawing>
-                  <wp:anchor distT="0" distB="0" distL="114300" distR="114300" simplePos="0" relativeHeight="251655168" behindDoc="0" locked="0" layoutInCell="1" allowOverlap="1" wp14:anchorId="6B6611F9" wp14:editId="5FF2B79A">
+                  <wp:anchor distT="0" distB="0" distL="114300" distR="114300" simplePos="0" relativeHeight="251652096" behindDoc="0" locked="0" layoutInCell="1" allowOverlap="1" wp14:anchorId="6B6611F9" wp14:editId="34032DBE">
                     <wp:simplePos x="0" y="0"/>
                     <wp:positionH relativeFrom="column">
                       <wp:posOffset>-473710</wp:posOffset>
@@ -695,7 +735,7 @@
               </mc:Choice>
               <mc:Fallback>
                 <w:pict>
-                  <v:line w14:anchorId="23B722BE" id="Gerader Verbinder 2" o:spid="_x0000_s1026" style="position:absolute;flip:y;z-index:251655168;visibility:visible;mso-wrap-style:square;mso-width-percent:0;mso-height-percent:0;mso-wrap-distance-left:9pt;mso-wrap-distance-top:0;mso-wrap-distance-right:9pt;mso-wrap-distance-bottom:0;mso-position-horizontal:absolute;mso-position-horizontal-relative:text;mso-position-vertical:absolute;mso-position-vertical-relative:text;mso-width-percent:0;mso-height-percent:0;mso-width-relative:margin;mso-height-relative:margin" from="-37.3pt,400.8pt" to="306.3pt,400.8pt" o:gfxdata="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" strokecolor="#e8e8e8 [3214]" strokeweight="1.5pt">
+                  <v:line w14:anchorId="1A658E80" id="Gerader Verbinder 2" o:spid="_x0000_s1026" style="position:absolute;flip:y;z-index:251652096;visibility:visible;mso-wrap-style:square;mso-width-percent:0;mso-height-percent:0;mso-wrap-distance-left:9pt;mso-wrap-distance-top:0;mso-wrap-distance-right:9pt;mso-wrap-distance-bottom:0;mso-position-horizontal:absolute;mso-position-horizontal-relative:text;mso-position-vertical:absolute;mso-position-vertical-relative:text;mso-width-percent:0;mso-height-percent:0;mso-width-relative:margin;mso-height-relative:margin" from="-37.3pt,400.8pt" to="306.3pt,400.8pt" o:gfxdata="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" strokecolor="#e8e8e8 [3214]" strokeweight="1.5pt">
                     <v:stroke joinstyle="miter"/>
                   </v:line>
                 </w:pict>
@@ -711,7 +751,14 @@
     <w:sdt>
       <w:sdtPr>
         <w:rPr>
-          <w:lang w:val="de-DE"/>
+          <w:rFonts w:asciiTheme="minorHAnsi" w:eastAsiaTheme="minorHAnsi" w:hAnsiTheme="minorHAnsi" w:cstheme="minorBidi"/>
+          <w:b w:val="0"/>
+          <w:color w:val="auto"/>
+          <w:kern w:val="2"/>
+          <w:sz w:val="24"/>
+          <w:szCs w:val="24"/>
+          <w:lang w:val="de-DE" w:eastAsia="en-US"/>
+          <w14:ligatures w14:val="standardContextual"/>
         </w:rPr>
         <w:id w:val="1040557390"/>
         <w:docPartObj>
@@ -721,14 +768,7 @@
       </w:sdtPr>
       <w:sdtEndPr>
         <w:rPr>
-          <w:rFonts w:asciiTheme="minorHAnsi" w:eastAsiaTheme="minorHAnsi" w:hAnsiTheme="minorHAnsi" w:cstheme="minorBidi"/>
           <w:bCs/>
-          <w:color w:val="auto"/>
-          <w:kern w:val="2"/>
-          <w:sz w:val="24"/>
-          <w:szCs w:val="24"/>
-          <w:lang w:eastAsia="en-US"/>
-          <w14:ligatures w14:val="standardContextual"/>
         </w:rPr>
       </w:sdtEndPr>
       <w:sdtContent>
@@ -2122,7 +2162,15 @@
               <w:t>Tagesjournal erweitert und Überarbeitung des Dokuments</w:t>
             </w:r>
             <w:r>
-              <w:t xml:space="preserve"> (Projektbeschreibung, Riskien)</w:t>
+              <w:t xml:space="preserve"> (Projektbeschreibung, </w:t>
+            </w:r>
+            <w:proofErr w:type="spellStart"/>
+            <w:r>
+              <w:t>Riskien</w:t>
+            </w:r>
+            <w:proofErr w:type="spellEnd"/>
+            <w:r>
+              <w:t>)</w:t>
             </w:r>
           </w:p>
         </w:tc>
@@ -2174,25 +2222,41 @@
           <w:tcPr>
             <w:tcW w:w="2265" w:type="dxa"/>
           </w:tcPr>
-          <w:p/>
+          <w:p>
+            <w:r>
+              <w:t>Version 2.0</w:t>
+            </w:r>
+          </w:p>
         </w:tc>
         <w:tc>
           <w:tcPr>
             <w:tcW w:w="2265" w:type="dxa"/>
           </w:tcPr>
-          <w:p/>
+          <w:p>
+            <w:r>
+              <w:t>Mattia Tuor</w:t>
+            </w:r>
+          </w:p>
         </w:tc>
         <w:tc>
           <w:tcPr>
             <w:tcW w:w="2266" w:type="dxa"/>
           </w:tcPr>
-          <w:p/>
+          <w:p>
+            <w:r>
+              <w:t>08.06.2026</w:t>
+            </w:r>
+          </w:p>
         </w:tc>
         <w:tc>
           <w:tcPr>
             <w:tcW w:w="2266" w:type="dxa"/>
           </w:tcPr>
-          <w:p/>
+          <w:p>
+            <w:r>
+              <w:t>Tagesjournal erweitert</w:t>
+            </w:r>
+          </w:p>
         </w:tc>
       </w:tr>
       <w:tr>
@@ -2200,25 +2264,41 @@
           <w:tcPr>
             <w:tcW w:w="2265" w:type="dxa"/>
           </w:tcPr>
-          <w:p/>
+          <w:p>
+            <w:r>
+              <w:t>Version 2.1</w:t>
+            </w:r>
+          </w:p>
         </w:tc>
         <w:tc>
           <w:tcPr>
             <w:tcW w:w="2265" w:type="dxa"/>
           </w:tcPr>
-          <w:p/>
+          <w:p>
+            <w:r>
+              <w:t>Mattia Tuor</w:t>
+            </w:r>
+          </w:p>
         </w:tc>
         <w:tc>
           <w:tcPr>
             <w:tcW w:w="2266" w:type="dxa"/>
           </w:tcPr>
-          <w:p/>
+          <w:p>
+            <w:r>
+              <w:t>09.06.2026</w:t>
+            </w:r>
+          </w:p>
         </w:tc>
         <w:tc>
           <w:tcPr>
             <w:tcW w:w="2266" w:type="dxa"/>
           </w:tcPr>
-          <w:p/>
+          <w:p>
+            <w:r>
+              <w:t>Tagesjournal erweitert</w:t>
+            </w:r>
+          </w:p>
         </w:tc>
       </w:tr>
     </w:tbl>
@@ -2272,7 +2352,21 @@
         <w:rPr>
           <w:rFonts w:asciiTheme="majorHAnsi" w:hAnsiTheme="majorHAnsi"/>
         </w:rPr>
-        <w:t>Da ich regelmässig ins Gym gehe, habe ich mich schon länger gefragt, wie ich mein Training am besten dokumentieren kann. Ich wollte eine Möglichkeit haben, meine Wiederholungen, das verwendete Gewicht, Pausen und meine Trainingstage übersichtlich festzuhalten – alles an einem Ort. Als ich mir bestehende Apps angeschaut habe, war ich schnell enttäuscht: Die meisten sinnvollen Lösungen sind hinter Abonnements versteckt, mit Werbung überhäuft oder bieten Funktionen an, die ich gar nicht brauche. Eine einfache, saubere App, die genau das tut, was ich möchte</w:t>
+        <w:t xml:space="preserve">Da ich regelmässig ins </w:t>
+      </w:r>
+      <w:proofErr w:type="spellStart"/>
+      <w:r>
+        <w:rPr>
+          <w:rFonts w:asciiTheme="majorHAnsi" w:hAnsiTheme="majorHAnsi"/>
+        </w:rPr>
+        <w:t>Gym</w:t>
+      </w:r>
+      <w:proofErr w:type="spellEnd"/>
+      <w:r>
+        <w:rPr>
+          <w:rFonts w:asciiTheme="majorHAnsi" w:hAnsiTheme="majorHAnsi"/>
+        </w:rPr>
+        <w:t xml:space="preserve"> gehe, habe ich mich schon länger gefragt, wie ich mein Training am besten dokumentieren kann. Ich wollte eine Möglichkeit haben, meine Wiederholungen, das verwendete Gewicht, Pausen und meine Trainingstage übersichtlich festzuhalten – alles an einem Ort. Als ich mir bestehende Apps angeschaut habe, war ich schnell enttäuscht: Die meisten sinnvollen Lösungen sind hinter Abonnements versteckt, mit Werbung überhäuft oder bieten Funktionen an, die ich gar nicht brauche. Eine einfache, saubere App, die genau das tut, was ich möchte</w:t>
       </w:r>
       <w:r>
         <w:rPr>
@@ -2386,13 +2480,8 @@
       <w:r>
         <w:t>Planung</w:t>
       </w:r>
+      <w:bookmarkStart w:id="5" w:name="_Toc231370513"/>
       <w:bookmarkEnd w:id="4"/>
-    </w:p>
-    <w:p>
-      <w:pPr>
-        <w:pStyle w:val="berschrift2"/>
-      </w:pPr>
-      <w:bookmarkStart w:id="5" w:name="_Toc231370513"/>
     </w:p>
     <w:p>
       <w:pPr>
@@ -2405,7 +2494,7 @@
         <mc:AlternateContent>
           <mc:Choice Requires="wpg">
             <w:drawing>
-              <wp:anchor distT="0" distB="0" distL="114300" distR="114300" simplePos="0" relativeHeight="251666432" behindDoc="0" locked="0" layoutInCell="1" allowOverlap="1" wp14:anchorId="1B920DBE" wp14:editId="7D7A839B">
+              <wp:anchor distT="0" distB="0" distL="114300" distR="114300" simplePos="0" relativeHeight="251663360" behindDoc="0" locked="0" layoutInCell="1" allowOverlap="1" wp14:anchorId="1B920DBE" wp14:editId="78FEB30D">
                 <wp:simplePos x="0" y="0"/>
                 <wp:positionH relativeFrom="column">
                   <wp:posOffset>58614</wp:posOffset>
@@ -2416,7 +2505,7 @@
                 <wp:extent cx="5647690" cy="7292975"/>
                 <wp:effectExtent l="0" t="0" r="0" b="3175"/>
                 <wp:wrapSquare wrapText="bothSides"/>
-                <wp:docPr id="678255974" name="Gruppieren 4">
+                <wp:docPr id="678255974" name="Gruppieren 4" descr="Screenshot vom Zeitplan von GitHub Projects schön dargestellt in einem Gantt-Diagramm.">
                   <a:extLst xmlns:a="http://schemas.openxmlformats.org/drawingml/2006/main">
                     <a:ext uri="{C183D7F6-B498-43B3-948B-1728B52AA6E4}">
                       <adec:decorative xmlns:adec="http://schemas.microsoft.com/office/drawing/2017/decorative" val="0"/>
@@ -2504,27 +2593,20 @@
                               </w:pPr>
                               <w:bookmarkStart w:id="6" w:name="_Toc231378857"/>
                               <w:bookmarkStart w:id="7" w:name="_Toc231378931"/>
+                              <w:bookmarkStart w:id="8" w:name="_Toc231897937"/>
+                              <w:bookmarkStart w:id="9" w:name="_Toc231902172"/>
+                              <w:bookmarkStart w:id="10" w:name="_Toc231902364"/>
                               <w:r>
                                 <w:t xml:space="preserve">Abbildung </w:t>
                               </w:r>
-                              <w:r>
-                                <w:fldChar w:fldCharType="begin"/>
-                              </w:r>
-                              <w:r>
-                                <w:instrText xml:space="preserve"> SEQ Abbildung \* ARABIC </w:instrText>
-                              </w:r>
-                              <w:r>
-                                <w:fldChar w:fldCharType="separate"/>
-                              </w:r>
-                              <w:r>
-                                <w:rPr>
-                                  <w:noProof/>
-                                </w:rPr>
-                                <w:t>1</w:t>
-                              </w:r>
-                              <w:r>
-                                <w:fldChar w:fldCharType="end"/>
-                              </w:r>
+                              <w:fldSimple w:instr=" SEQ Abbildung \* ARABIC ">
+                                <w:r>
+                                  <w:rPr>
+                                    <w:noProof/>
+                                  </w:rPr>
+                                  <w:t>1</w:t>
+                                </w:r>
+                              </w:fldSimple>
                               <w:r>
                                 <w:t>: Zeitplan von GitHub Projects schön dargestellt in einem</w:t>
                               </w:r>
@@ -2545,6 +2627,9 @@
                               </w:r>
                               <w:bookmarkEnd w:id="6"/>
                               <w:bookmarkEnd w:id="7"/>
+                              <w:bookmarkEnd w:id="8"/>
+                              <w:bookmarkEnd w:id="9"/>
+                              <w:bookmarkEnd w:id="10"/>
                             </w:p>
                           </w:txbxContent>
                         </wps:txbx>
@@ -2563,7 +2648,7 @@
           </mc:Choice>
           <mc:Fallback>
             <w:pict>
-              <v:group w14:anchorId="1B920DBE" id="Gruppieren 4" o:spid="_x0000_s1029" style="position:absolute;margin-left:4.6pt;margin-top:28.85pt;width:444.7pt;height:574.25pt;z-index:251666432" coordsize="56476,72929" o:gfxdata="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">
+              <v:group w14:anchorId="1B920DBE" id="Gruppieren 4" o:spid="_x0000_s1029" alt="Screenshot vom Zeitplan von GitHub Projects schön dargestellt in einem Gantt-Diagramm." style="position:absolute;margin-left:4.6pt;margin-top:28.85pt;width:444.7pt;height:574.25pt;z-index:251663360" coordsize="56476,72929" o:gfxdata="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">
                 <v:shapetype id="_x0000_t75" coordsize="21600,21600" o:spt="75" o:preferrelative="t" path="m@4@5l@4@11@9@11@9@5xe" filled="f" stroked="f">
                   <v:stroke joinstyle="miter"/>
                   <v:formulas>
@@ -2597,29 +2682,22 @@
                             <w:noProof/>
                           </w:rPr>
                         </w:pPr>
-                        <w:bookmarkStart w:id="8" w:name="_Toc231378857"/>
-                        <w:bookmarkStart w:id="9" w:name="_Toc231378931"/>
+                        <w:bookmarkStart w:id="11" w:name="_Toc231378857"/>
+                        <w:bookmarkStart w:id="12" w:name="_Toc231378931"/>
+                        <w:bookmarkStart w:id="13" w:name="_Toc231897937"/>
+                        <w:bookmarkStart w:id="14" w:name="_Toc231902172"/>
+                        <w:bookmarkStart w:id="15" w:name="_Toc231902364"/>
                         <w:r>
                           <w:t xml:space="preserve">Abbildung </w:t>
                         </w:r>
-                        <w:r>
-                          <w:fldChar w:fldCharType="begin"/>
-                        </w:r>
-                        <w:r>
-                          <w:instrText xml:space="preserve"> SEQ Abbildung \* ARABIC </w:instrText>
-                        </w:r>
-                        <w:r>
-                          <w:fldChar w:fldCharType="separate"/>
-                        </w:r>
-                        <w:r>
-                          <w:rPr>
-                            <w:noProof/>
-                          </w:rPr>
-                          <w:t>1</w:t>
-                        </w:r>
-                        <w:r>
-                          <w:fldChar w:fldCharType="end"/>
-                        </w:r>
+                        <w:fldSimple w:instr=" SEQ Abbildung \* ARABIC ">
+                          <w:r>
+                            <w:rPr>
+                              <w:noProof/>
+                            </w:rPr>
+                            <w:t>1</w:t>
+                          </w:r>
+                        </w:fldSimple>
                         <w:r>
                           <w:t>: Zeitplan von GitHub Projects schön dargestellt in einem</w:t>
                         </w:r>
@@ -2638,8 +2716,11 @@
                         <w:r>
                           <w:t>.</w:t>
                         </w:r>
-                        <w:bookmarkEnd w:id="8"/>
-                        <w:bookmarkEnd w:id="9"/>
+                        <w:bookmarkEnd w:id="11"/>
+                        <w:bookmarkEnd w:id="12"/>
+                        <w:bookmarkEnd w:id="13"/>
+                        <w:bookmarkEnd w:id="14"/>
+                        <w:bookmarkEnd w:id="15"/>
                       </w:p>
                     </w:txbxContent>
                   </v:textbox>
@@ -2660,12 +2741,12 @@
       <w:pPr>
         <w:pStyle w:val="berschrift2"/>
       </w:pPr>
-      <w:bookmarkStart w:id="10" w:name="_Toc231370514"/>
+      <w:bookmarkStart w:id="16" w:name="_Toc231370514"/>
       <w:r>
         <w:lastRenderedPageBreak/>
         <w:t>2.2 Entscheidungsmatrix</w:t>
       </w:r>
-      <w:bookmarkEnd w:id="10"/>
+      <w:bookmarkEnd w:id="16"/>
     </w:p>
     <w:p>
       <w:r>
@@ -3907,7 +3988,7 @@
       <w:pPr>
         <w:pStyle w:val="berschrift1"/>
       </w:pPr>
-      <w:bookmarkStart w:id="11" w:name="_Toc231370515"/>
+      <w:bookmarkStart w:id="17" w:name="_Toc231370515"/>
       <w:r>
         <w:lastRenderedPageBreak/>
         <w:t xml:space="preserve">3. </w:t>
@@ -3915,57 +3996,57 @@
       <w:r>
         <w:t>Hauptteil</w:t>
       </w:r>
-      <w:bookmarkEnd w:id="11"/>
+      <w:bookmarkEnd w:id="17"/>
     </w:p>
     <w:p>
       <w:pPr>
         <w:pStyle w:val="berschrift2"/>
       </w:pPr>
-      <w:bookmarkStart w:id="12" w:name="_Toc231370516"/>
+      <w:bookmarkStart w:id="18" w:name="_Toc231370516"/>
       <w:r>
         <w:t>3.1 Vorgehen und Zwischenschritte</w:t>
       </w:r>
-      <w:bookmarkEnd w:id="12"/>
+      <w:bookmarkEnd w:id="18"/>
     </w:p>
     <w:p>
       <w:pPr>
         <w:pStyle w:val="berschrift2"/>
       </w:pPr>
-      <w:bookmarkStart w:id="13" w:name="_Toc231370517"/>
+      <w:bookmarkStart w:id="19" w:name="_Toc231370517"/>
       <w:r>
         <w:t>3.2 Ergebnis der Arbeit</w:t>
       </w:r>
-      <w:bookmarkEnd w:id="13"/>
+      <w:bookmarkEnd w:id="19"/>
     </w:p>
     <w:p>
       <w:pPr>
         <w:pStyle w:val="berschrift2"/>
       </w:pPr>
-      <w:bookmarkStart w:id="14" w:name="_Toc231370518"/>
+      <w:bookmarkStart w:id="20" w:name="_Toc231370518"/>
       <w:r>
         <w:t>3.3 Funktionsbeschreibung</w:t>
       </w:r>
-      <w:bookmarkEnd w:id="14"/>
+      <w:bookmarkEnd w:id="20"/>
     </w:p>
     <w:p>
       <w:pPr>
         <w:pStyle w:val="berschrift2"/>
       </w:pPr>
-      <w:bookmarkStart w:id="15" w:name="_Toc231370519"/>
+      <w:bookmarkStart w:id="21" w:name="_Toc231370519"/>
       <w:r>
         <w:t>3.4 Arbeitsjournal</w:t>
       </w:r>
-      <w:bookmarkEnd w:id="15"/>
+      <w:bookmarkEnd w:id="21"/>
     </w:p>
     <w:p>
       <w:pPr>
         <w:pStyle w:val="berschrift3"/>
       </w:pPr>
-      <w:bookmarkStart w:id="16" w:name="_Toc231370520"/>
+      <w:bookmarkStart w:id="22" w:name="_Toc231370520"/>
       <w:r>
         <w:t>Woche 1</w:t>
       </w:r>
-      <w:bookmarkEnd w:id="16"/>
+      <w:bookmarkEnd w:id="22"/>
     </w:p>
     <w:p>
       <w:pPr>
@@ -3989,7 +4070,7 @@
         <mc:AlternateContent>
           <mc:Choice Requires="wpg">
             <w:drawing>
-              <wp:anchor distT="0" distB="0" distL="114300" distR="114300" simplePos="0" relativeHeight="251669504" behindDoc="0" locked="0" layoutInCell="1" allowOverlap="1" wp14:anchorId="3939A99B" wp14:editId="41B472BD">
+              <wp:anchor distT="0" distB="0" distL="114300" distR="114300" simplePos="0" relativeHeight="251666432" behindDoc="0" locked="0" layoutInCell="1" allowOverlap="1" wp14:anchorId="3939A99B" wp14:editId="5E28028A">
                 <wp:simplePos x="0" y="0"/>
                 <wp:positionH relativeFrom="column">
                   <wp:posOffset>4418965</wp:posOffset>
@@ -4064,29 +4145,97 @@
                                   <w:rFonts w:asciiTheme="majorHAnsi" w:hAnsiTheme="majorHAnsi"/>
                                 </w:rPr>
                               </w:pPr>
-                              <w:bookmarkStart w:id="17" w:name="_Toc231378858"/>
-                              <w:bookmarkStart w:id="18" w:name="_Toc231378932"/>
+                              <w:bookmarkStart w:id="23" w:name="_Toc231378858"/>
+                              <w:bookmarkStart w:id="24" w:name="_Toc231378932"/>
+                              <w:bookmarkStart w:id="25" w:name="_Toc231897939"/>
                               <w:r>
                                 <w:t xml:space="preserve">Abbildung </w:t>
                               </w:r>
                               <w:r>
-                                <w:fldChar w:fldCharType="begin"/>
+                                <w:t>2</w:t>
                               </w:r>
                               <w:r>
-                                <w:instrText xml:space="preserve"> SEQ Abbildung \* ARABIC </w:instrText>
-                              </w:r>
-                              <w:r>
-                                <w:fldChar w:fldCharType="separate"/>
+                                <w:t>:</w:t>
                               </w:r>
                               <w:r>
                                 <w:rPr>
-                                  <w:noProof/>
+                                  <w:iCs w:val="0"/>
+                                  <w:color w:val="auto"/>
+                                  <w:sz w:val="24"/>
+                                  <w:szCs w:val="24"/>
                                 </w:rPr>
-                                <w:t>2</w:t>
+                                <w:t xml:space="preserve"> </w:t>
                               </w:r>
                               <w:r>
-                                <w:fldChar w:fldCharType="end"/>
+                                <w:t>Screenshot des aktuellen Stand</w:t>
                               </w:r>
+                              <w:r>
+                                <w:t>e</w:t>
+                              </w:r>
+                              <w:r>
+                                <w:t>s de</w:t>
+                              </w:r>
+                              <w:r>
+                                <w:t xml:space="preserve">r </w:t>
+                              </w:r>
+                              <w:r>
+                                <w:t>Expo-App</w:t>
+                              </w:r>
+                              <w:bookmarkEnd w:id="25"/>
+                            </w:p>
+                            <w:p/>
+                            <w:p>
+                              <w:pPr>
+                                <w:pStyle w:val="Beschriftung"/>
+                                <w:rPr>
+                                  <w:rFonts w:asciiTheme="majorHAnsi" w:hAnsiTheme="majorHAnsi"/>
+                                </w:rPr>
+                              </w:pPr>
+                              <w:bookmarkStart w:id="26" w:name="_Toc231897940"/>
+                              <w:bookmarkStart w:id="27" w:name="_Toc231902173"/>
+                              <w:bookmarkStart w:id="28" w:name="_Toc231902365"/>
+                              <w:r>
+                                <w:t xml:space="preserve">Abbildung </w:t>
+                              </w:r>
+                              <w:fldSimple w:instr=" SEQ Abbildung \* ARABIC ">
+                                <w:r>
+                                  <w:rPr>
+                                    <w:noProof/>
+                                  </w:rPr>
+                                  <w:t>2</w:t>
+                                </w:r>
+                              </w:fldSimple>
+                              <w:r>
+                                <w:t xml:space="preserve">: </w:t>
+                              </w:r>
+                              <w:r>
+                                <w:t>Screenshot des aktuellen Stands de</w:t>
+                              </w:r>
+                              <w:r>
+                                <w:t xml:space="preserve">r </w:t>
+                              </w:r>
+                              <w:r>
+                                <w:t>Expo-</w:t>
+                              </w:r>
+                              <w:proofErr w:type="spellStart"/>
+                              <w:r>
+                                <w:t>App</w:t>
+                              </w:r>
+                              <w:r>
+                                <w:t>Abbildung</w:t>
+                              </w:r>
+                              <w:proofErr w:type="spellEnd"/>
+                              <w:r>
+                                <w:t xml:space="preserve"> </w:t>
+                              </w:r>
+                              <w:fldSimple w:instr=" SEQ Abbildung \* ARABIC ">
+                                <w:r>
+                                  <w:rPr>
+                                    <w:noProof/>
+                                  </w:rPr>
+                                  <w:t>3</w:t>
+                                </w:r>
+                              </w:fldSimple>
                               <w:r>
                                 <w:t>:</w:t>
                               </w:r>
@@ -4108,8 +4257,11 @@
                               <w:r>
                                 <w:t>Expo-App</w:t>
                               </w:r>
-                              <w:bookmarkEnd w:id="17"/>
-                              <w:bookmarkEnd w:id="18"/>
+                              <w:bookmarkEnd w:id="23"/>
+                              <w:bookmarkEnd w:id="24"/>
+                              <w:bookmarkEnd w:id="26"/>
+                              <w:bookmarkEnd w:id="27"/>
+                              <w:bookmarkEnd w:id="28"/>
                             </w:p>
                           </w:txbxContent>
                         </wps:txbx>
@@ -4134,7 +4286,7 @@
           </mc:Choice>
           <mc:Fallback>
             <w:pict>
-              <v:group w14:anchorId="3939A99B" id="Gruppieren 5" o:spid="_x0000_s1032" alt="Screenshot des aktuellen Stands der Expo-App. Man sieht die Startseite der App und kann den Titel &quot;GymTracker&quot; und den Untertitel &quot;Willkommen!&quot; in der Mitte des Bildschirms lesen." style="position:absolute;margin-left:347.95pt;margin-top:.35pt;width:93.9pt;height:224.15pt;z-index:251669504;mso-width-relative:margin;mso-height-relative:margin" coordsize="13011,34969" o:gfxdata="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">
+              <v:group w14:anchorId="3939A99B" id="Gruppieren 5" o:spid="_x0000_s1032" alt="Screenshot des aktuellen Stands der Expo-App. Man sieht die Startseite der App und kann den Titel &quot;GymTracker&quot; und den Untertitel &quot;Willkommen!&quot; in der Mitte des Bildschirms lesen." style="position:absolute;margin-left:347.95pt;margin-top:.35pt;width:93.9pt;height:224.15pt;z-index:251666432;mso-width-relative:margin;mso-height-relative:margin" coordsize="13011,34969" o:gfxdata="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">
                 <v:shape id="Grafik 1" o:spid="_x0000_s1033" type="#_x0000_t75" style="position:absolute;width:13011;height:27527;visibility:visible;mso-wrap-style:square" o:gfxdata="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">
                   <v:imagedata r:id="rId12" o:title=""/>
                 </v:shape>
@@ -4148,29 +4300,97 @@
                             <w:rFonts w:asciiTheme="majorHAnsi" w:hAnsiTheme="majorHAnsi"/>
                           </w:rPr>
                         </w:pPr>
-                        <w:bookmarkStart w:id="19" w:name="_Toc231378858"/>
-                        <w:bookmarkStart w:id="20" w:name="_Toc231378932"/>
+                        <w:bookmarkStart w:id="29" w:name="_Toc231378858"/>
+                        <w:bookmarkStart w:id="30" w:name="_Toc231378932"/>
+                        <w:bookmarkStart w:id="31" w:name="_Toc231897939"/>
                         <w:r>
                           <w:t xml:space="preserve">Abbildung </w:t>
                         </w:r>
                         <w:r>
-                          <w:fldChar w:fldCharType="begin"/>
+                          <w:t>2</w:t>
                         </w:r>
                         <w:r>
-                          <w:instrText xml:space="preserve"> SEQ Abbildung \* ARABIC </w:instrText>
-                        </w:r>
-                        <w:r>
-                          <w:fldChar w:fldCharType="separate"/>
+                          <w:t>:</w:t>
                         </w:r>
                         <w:r>
                           <w:rPr>
-                            <w:noProof/>
+                            <w:iCs w:val="0"/>
+                            <w:color w:val="auto"/>
+                            <w:sz w:val="24"/>
+                            <w:szCs w:val="24"/>
                           </w:rPr>
-                          <w:t>2</w:t>
+                          <w:t xml:space="preserve"> </w:t>
                         </w:r>
                         <w:r>
-                          <w:fldChar w:fldCharType="end"/>
+                          <w:t>Screenshot des aktuellen Stand</w:t>
                         </w:r>
+                        <w:r>
+                          <w:t>e</w:t>
+                        </w:r>
+                        <w:r>
+                          <w:t>s de</w:t>
+                        </w:r>
+                        <w:r>
+                          <w:t xml:space="preserve">r </w:t>
+                        </w:r>
+                        <w:r>
+                          <w:t>Expo-App</w:t>
+                        </w:r>
+                        <w:bookmarkEnd w:id="31"/>
+                      </w:p>
+                      <w:p/>
+                      <w:p>
+                        <w:pPr>
+                          <w:pStyle w:val="Beschriftung"/>
+                          <w:rPr>
+                            <w:rFonts w:asciiTheme="majorHAnsi" w:hAnsiTheme="majorHAnsi"/>
+                          </w:rPr>
+                        </w:pPr>
+                        <w:bookmarkStart w:id="32" w:name="_Toc231897940"/>
+                        <w:bookmarkStart w:id="33" w:name="_Toc231902173"/>
+                        <w:bookmarkStart w:id="34" w:name="_Toc231902365"/>
+                        <w:r>
+                          <w:t xml:space="preserve">Abbildung </w:t>
+                        </w:r>
+                        <w:fldSimple w:instr=" SEQ Abbildung \* ARABIC ">
+                          <w:r>
+                            <w:rPr>
+                              <w:noProof/>
+                            </w:rPr>
+                            <w:t>2</w:t>
+                          </w:r>
+                        </w:fldSimple>
+                        <w:r>
+                          <w:t xml:space="preserve">: </w:t>
+                        </w:r>
+                        <w:r>
+                          <w:t>Screenshot des aktuellen Stands de</w:t>
+                        </w:r>
+                        <w:r>
+                          <w:t xml:space="preserve">r </w:t>
+                        </w:r>
+                        <w:r>
+                          <w:t>Expo-</w:t>
+                        </w:r>
+                        <w:proofErr w:type="spellStart"/>
+                        <w:r>
+                          <w:t>App</w:t>
+                        </w:r>
+                        <w:r>
+                          <w:t>Abbildung</w:t>
+                        </w:r>
+                        <w:proofErr w:type="spellEnd"/>
+                        <w:r>
+                          <w:t xml:space="preserve"> </w:t>
+                        </w:r>
+                        <w:fldSimple w:instr=" SEQ Abbildung \* ARABIC ">
+                          <w:r>
+                            <w:rPr>
+                              <w:noProof/>
+                            </w:rPr>
+                            <w:t>3</w:t>
+                          </w:r>
+                        </w:fldSimple>
                         <w:r>
                           <w:t>:</w:t>
                         </w:r>
@@ -4192,8 +4412,11 @@
                         <w:r>
                           <w:t>Expo-App</w:t>
                         </w:r>
-                        <w:bookmarkEnd w:id="19"/>
-                        <w:bookmarkEnd w:id="20"/>
+                        <w:bookmarkEnd w:id="29"/>
+                        <w:bookmarkEnd w:id="30"/>
+                        <w:bookmarkEnd w:id="32"/>
+                        <w:bookmarkEnd w:id="33"/>
+                        <w:bookmarkEnd w:id="34"/>
                       </w:p>
                     </w:txbxContent>
                   </v:textbox>
@@ -4208,7 +4431,21 @@
         <w:rPr>
           <w:rFonts w:asciiTheme="majorHAnsi" w:hAnsiTheme="majorHAnsi"/>
         </w:rPr>
-        <w:t>Heute habe ich mit dem Projekt gestartet und zunächst ein GitHub Repository eingerichtet. Anschliessend habe ich ein GitHub Project erstellt, alle Milestones und Issues angelegt und diese auf der Roadmap eingeplant, damit ich während der gesamten Projektzeit einen klaren Überblick über den Fortschritt habe.</w:t>
+        <w:t xml:space="preserve">Heute habe ich mit dem Projekt gestartet und zunächst ein GitHub Repository eingerichtet. Anschliessend habe ich ein GitHub Project erstellt, alle Milestones und </w:t>
+      </w:r>
+      <w:proofErr w:type="spellStart"/>
+      <w:r>
+        <w:rPr>
+          <w:rFonts w:asciiTheme="majorHAnsi" w:hAnsiTheme="majorHAnsi"/>
+        </w:rPr>
+        <w:t>Issues</w:t>
+      </w:r>
+      <w:proofErr w:type="spellEnd"/>
+      <w:r>
+        <w:rPr>
+          <w:rFonts w:asciiTheme="majorHAnsi" w:hAnsiTheme="majorHAnsi"/>
+        </w:rPr>
+        <w:t xml:space="preserve"> angelegt und diese auf der Roadmap eingeplant, damit ich während der gesamten Projektzeit einen klaren Überblick über den Fortschritt habe.</w:t>
       </w:r>
       <w:r>
         <w:rPr>
@@ -4263,7 +4500,7 @@
         <mc:AlternateContent>
           <mc:Choice Requires="wpg">
             <w:drawing>
-              <wp:anchor distT="0" distB="0" distL="114300" distR="114300" simplePos="0" relativeHeight="251674624" behindDoc="0" locked="0" layoutInCell="1" allowOverlap="1" wp14:anchorId="5D50BC68" wp14:editId="303A2177">
+              <wp:anchor distT="0" distB="0" distL="114300" distR="114300" simplePos="0" relativeHeight="251671552" behindDoc="0" locked="0" layoutInCell="1" allowOverlap="1" wp14:anchorId="5D50BC68" wp14:editId="3FF65C0C">
                 <wp:simplePos x="0" y="0"/>
                 <wp:positionH relativeFrom="column">
                   <wp:posOffset>4323715</wp:posOffset>
@@ -4350,34 +4587,23 @@
                                   <w:noProof/>
                                 </w:rPr>
                               </w:pPr>
-                              <w:bookmarkStart w:id="21" w:name="_Toc231378859"/>
-                              <w:bookmarkStart w:id="22" w:name="_Toc231378933"/>
+                              <w:bookmarkStart w:id="35" w:name="_Toc231378859"/>
+                              <w:bookmarkStart w:id="36" w:name="_Toc231378933"/>
+                              <w:bookmarkStart w:id="37" w:name="_Toc231897941"/>
                               <w:r>
                                 <w:t xml:space="preserve">Abbildung </w:t>
                               </w:r>
                               <w:r>
-                                <w:fldChar w:fldCharType="begin"/>
+                                <w:t xml:space="preserve">3: </w:t>
                               </w:r>
                               <w:r>
-                                <w:instrText xml:space="preserve"> SEQ Abbildung \* ARABIC </w:instrText>
+                                <w:t>Screenshot des aktuellen Stand</w:t>
                               </w:r>
                               <w:r>
-                                <w:fldChar w:fldCharType="separate"/>
+                                <w:t>es</w:t>
                               </w:r>
                               <w:r>
-                                <w:rPr>
-                                  <w:noProof/>
-                                </w:rPr>
-                                <w:t>3</w:t>
-                              </w:r>
-                              <w:r>
-                                <w:fldChar w:fldCharType="end"/>
-                              </w:r>
-                              <w:r>
-                                <w:t xml:space="preserve">: </w:t>
-                              </w:r>
-                              <w:r>
-                                <w:t>Screenshot des aktuellen Stands de</w:t>
+                                <w:t xml:space="preserve"> de</w:t>
                               </w:r>
                               <w:r>
                                 <w:t xml:space="preserve">r </w:t>
@@ -4385,8 +4611,9 @@
                               <w:r>
                                 <w:t>Expo-App</w:t>
                               </w:r>
-                              <w:bookmarkEnd w:id="21"/>
-                              <w:bookmarkEnd w:id="22"/>
+                              <w:bookmarkEnd w:id="35"/>
+                              <w:bookmarkEnd w:id="36"/>
+                              <w:bookmarkEnd w:id="37"/>
                             </w:p>
                           </w:txbxContent>
                         </wps:txbx>
@@ -4408,7 +4635,7 @@
           </mc:Choice>
           <mc:Fallback>
             <w:pict>
-              <v:group w14:anchorId="5D50BC68" id="Gruppieren 7" o:spid="_x0000_s1035" alt="Screenshot des aktuellen Stands der Expo-App. Man sieht gleich wie beim letzten Screenshot den Titel und den Untertitel. Neu dazugekommen, sind die 4 verschiedenen Seiten die unten zu sehen sind. Über diese 4 Punkte kann man in der App zwischen den Seiten wechseln." style="position:absolute;margin-left:340.45pt;margin-top:5.15pt;width:88.25pt;height:227.75pt;z-index:251674624;mso-height-relative:margin" coordsize="11207,29984" o:gfxdata="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">
+              <v:group w14:anchorId="5D50BC68" id="Gruppieren 7" o:spid="_x0000_s1035" alt="Screenshot des aktuellen Stands der Expo-App. Man sieht gleich wie beim letzten Screenshot den Titel und den Untertitel. Neu dazugekommen, sind die 4 verschiedenen Seiten die unten zu sehen sind. Über diese 4 Punkte kann man in der App zwischen den Seiten wechseln." style="position:absolute;margin-left:340.45pt;margin-top:5.15pt;width:88.25pt;height:227.75pt;z-index:251671552;mso-height-relative:margin" coordsize="11207,29984" o:gfxdata="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">
                 <v:shape id="Grafik 6" o:spid="_x0000_s1036" type="#_x0000_t75" style="position:absolute;width:11207;height:23717;visibility:visible;mso-wrap-style:square" o:gfxdata="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">
                   <v:imagedata r:id="rId14" o:title=""/>
                 </v:shape>
@@ -4423,34 +4650,23 @@
                             <w:noProof/>
                           </w:rPr>
                         </w:pPr>
-                        <w:bookmarkStart w:id="23" w:name="_Toc231378859"/>
-                        <w:bookmarkStart w:id="24" w:name="_Toc231378933"/>
+                        <w:bookmarkStart w:id="38" w:name="_Toc231378859"/>
+                        <w:bookmarkStart w:id="39" w:name="_Toc231378933"/>
+                        <w:bookmarkStart w:id="40" w:name="_Toc231897941"/>
                         <w:r>
                           <w:t xml:space="preserve">Abbildung </w:t>
                         </w:r>
                         <w:r>
-                          <w:fldChar w:fldCharType="begin"/>
+                          <w:t xml:space="preserve">3: </w:t>
                         </w:r>
                         <w:r>
-                          <w:instrText xml:space="preserve"> SEQ Abbildung \* ARABIC </w:instrText>
+                          <w:t>Screenshot des aktuellen Stand</w:t>
                         </w:r>
                         <w:r>
-                          <w:fldChar w:fldCharType="separate"/>
+                          <w:t>es</w:t>
                         </w:r>
                         <w:r>
-                          <w:rPr>
-                            <w:noProof/>
-                          </w:rPr>
-                          <w:t>3</w:t>
-                        </w:r>
-                        <w:r>
-                          <w:fldChar w:fldCharType="end"/>
-                        </w:r>
-                        <w:r>
-                          <w:t xml:space="preserve">: </w:t>
-                        </w:r>
-                        <w:r>
-                          <w:t>Screenshot des aktuellen Stands de</w:t>
+                          <w:t xml:space="preserve"> de</w:t>
                         </w:r>
                         <w:r>
                           <w:t xml:space="preserve">r </w:t>
@@ -4458,8 +4674,9 @@
                         <w:r>
                           <w:t>Expo-App</w:t>
                         </w:r>
-                        <w:bookmarkEnd w:id="23"/>
-                        <w:bookmarkEnd w:id="24"/>
+                        <w:bookmarkEnd w:id="38"/>
+                        <w:bookmarkEnd w:id="39"/>
+                        <w:bookmarkEnd w:id="40"/>
                       </w:p>
                     </w:txbxContent>
                   </v:textbox>
@@ -4474,7 +4691,35 @@
         <w:rPr>
           <w:rFonts w:asciiTheme="majorHAnsi" w:hAnsiTheme="majorHAnsi"/>
         </w:rPr>
-        <w:t>Heute habe ich die Navigation der App eingerichtet und das Backend aufgesetzt. Als erstes habe ich React Navigation installiert und einen Bottom Tab Navigator erstellt. Dafür habe ich die drei fehlenden Screens WorkoutScreen.js, HistoryScreen.js und StatsScreen.js als Placeholder angelegt sowie die Datei AppNavigator.js erstellt, welche die gesamte Navigation der App verwaltet. Die App.js wurde so angepasst, dass sie nur noch den AppNavigator lädt. Nach dem Start der App waren unten vier Tabs sichtbar – Home, Workout, Historie und Statistiken – und die Navigation zwischen den Screens funktionierte einwandfrei.</w:t>
+        <w:t xml:space="preserve">Heute habe ich die Navigation der App eingerichtet und das Backend aufgesetzt. Als erstes habe ich React Navigation installiert und einen Bottom Tab Navigator erstellt. Dafür habe ich die drei fehlenden Screens WorkoutScreen.js, HistoryScreen.js und StatsScreen.js als </w:t>
+      </w:r>
+      <w:proofErr w:type="spellStart"/>
+      <w:r>
+        <w:rPr>
+          <w:rFonts w:asciiTheme="majorHAnsi" w:hAnsiTheme="majorHAnsi"/>
+        </w:rPr>
+        <w:t>Placeholder</w:t>
+      </w:r>
+      <w:proofErr w:type="spellEnd"/>
+      <w:r>
+        <w:rPr>
+          <w:rFonts w:asciiTheme="majorHAnsi" w:hAnsiTheme="majorHAnsi"/>
+        </w:rPr>
+        <w:t xml:space="preserve"> angelegt sowie die Datei AppNavigator.js erstellt, welche die gesamte Navigation der App verwaltet. Die App.js wurde so angepasst, dass sie nur noch den </w:t>
+      </w:r>
+      <w:proofErr w:type="spellStart"/>
+      <w:r>
+        <w:rPr>
+          <w:rFonts w:asciiTheme="majorHAnsi" w:hAnsiTheme="majorHAnsi"/>
+        </w:rPr>
+        <w:t>AppNavigator</w:t>
+      </w:r>
+      <w:proofErr w:type="spellEnd"/>
+      <w:r>
+        <w:rPr>
+          <w:rFonts w:asciiTheme="majorHAnsi" w:hAnsiTheme="majorHAnsi"/>
+        </w:rPr>
+        <w:t xml:space="preserve"> lädt. Nach dem Start der App waren unten vier Tabs sichtbar – Home, Workout, Historie und Statistiken – und die Navigation zwischen den Screens funktionierte einwandfrei.</w:t>
       </w:r>
       <w:r>
         <w:rPr>
@@ -4486,14 +4731,70 @@
         <w:rPr>
           <w:rFonts w:asciiTheme="majorHAnsi" w:hAnsiTheme="majorHAnsi"/>
         </w:rPr>
-        <w:t xml:space="preserve">Anschliessend habe ich das Backend aufgesetzt. Ich habe einen separaten backend Ordner erstellt und dort ein neues Node.js Projekt mit Express initialisiert. Zusätzlich habe ich cors installiert, damit das Frontend später problemlos mit dem Backend kommunizieren kann, sowie nodemon als </w:t>
+        <w:t xml:space="preserve">Anschliessend habe ich das Backend aufgesetzt. Ich habe einen separaten backend Ordner erstellt und dort ein neues Node.js Projekt mit Express initialisiert. Zusätzlich habe ich </w:t>
+      </w:r>
+      <w:proofErr w:type="spellStart"/>
+      <w:r>
+        <w:rPr>
+          <w:rFonts w:asciiTheme="majorHAnsi" w:hAnsiTheme="majorHAnsi"/>
+        </w:rPr>
+        <w:t>cors</w:t>
+      </w:r>
+      <w:proofErr w:type="spellEnd"/>
+      <w:r>
+        <w:rPr>
+          <w:rFonts w:asciiTheme="majorHAnsi" w:hAnsiTheme="majorHAnsi"/>
+        </w:rPr>
+        <w:t xml:space="preserve"> installiert, damit das Frontend später problemlos mit dem Backend kommunizieren kann, sowie </w:t>
+      </w:r>
+      <w:proofErr w:type="spellStart"/>
+      <w:r>
+        <w:rPr>
+          <w:rFonts w:asciiTheme="majorHAnsi" w:hAnsiTheme="majorHAnsi"/>
+        </w:rPr>
+        <w:t>nodemon</w:t>
+      </w:r>
+      <w:proofErr w:type="spellEnd"/>
+      <w:r>
+        <w:rPr>
+          <w:rFonts w:asciiTheme="majorHAnsi" w:hAnsiTheme="majorHAnsi"/>
+        </w:rPr>
+        <w:t xml:space="preserve"> als </w:t>
       </w:r>
       <w:r>
         <w:rPr>
           <w:rFonts w:asciiTheme="majorHAnsi" w:hAnsiTheme="majorHAnsi"/>
         </w:rPr>
         <w:lastRenderedPageBreak/>
-        <w:t>Entwicklungshilfe, damit der Server bei Änderungen automatisch neu startet. Als ersten Test habe ich einen /health Endpoint erstellt und den Server gestartet. Der Aufruf von http://localhost:3000/health im Browser hat den erwarteten Status zurückgegeben</w:t>
+        <w:t>Entwicklungshilfe, damit der Server bei Änderungen automatisch neu startet. Als ersten Test habe ich einen /</w:t>
+      </w:r>
+      <w:proofErr w:type="spellStart"/>
+      <w:r>
+        <w:rPr>
+          <w:rFonts w:asciiTheme="majorHAnsi" w:hAnsiTheme="majorHAnsi"/>
+        </w:rPr>
+        <w:t>health</w:t>
+      </w:r>
+      <w:proofErr w:type="spellEnd"/>
+      <w:r>
+        <w:rPr>
+          <w:rFonts w:asciiTheme="majorHAnsi" w:hAnsiTheme="majorHAnsi"/>
+        </w:rPr>
+        <w:t xml:space="preserve"> </w:t>
+      </w:r>
+      <w:proofErr w:type="spellStart"/>
+      <w:r>
+        <w:rPr>
+          <w:rFonts w:asciiTheme="majorHAnsi" w:hAnsiTheme="majorHAnsi"/>
+        </w:rPr>
+        <w:t>Endpoint</w:t>
+      </w:r>
+      <w:proofErr w:type="spellEnd"/>
+      <w:r>
+        <w:rPr>
+          <w:rFonts w:asciiTheme="majorHAnsi" w:hAnsiTheme="majorHAnsi"/>
+        </w:rPr>
+        <w:t xml:space="preserve"> erstellt und den Server gestartet. Der Aufruf von http://localhost:3000/health im Browser hat den erwarteten Status zurückgegeben</w:t>
       </w:r>
       <w:r>
         <w:rPr>
@@ -4524,39 +4825,934 @@
     </w:p>
     <w:p>
       <w:r>
-        <w:t>Heute habe ich die Datenbank eingerichtet und Prisma als ORM ins Backend integriert. Zuerst habe ich Prisma mit dem Befehl npx prisma init initialisiert, wobei SQLite als Datenbank gewählt wurde. Da ich Prisma Version 7 verwende, musste die Datenbankverbindung nicht in der schema.prisma definiert werden, sondern wird über die bereits automatisch generierte prisma.config.ts Datei verwaltet. Nach der Anpassung der schema.prisma habe ich mit npx prisma migrate dev --name init die Datenbank erstellt. Die Datei dev.db wurde dabei automatisch angelegt. Zum Abschluss habe ich Prisma Studio mit npx prisma studio gestartet und konnte die Datenbank erfolgreich im Browser aufrufen.</w:t>
+        <w:rPr>
+          <w:noProof/>
+        </w:rPr>
+        <mc:AlternateContent>
+          <mc:Choice Requires="wpg">
+            <w:drawing>
+              <wp:anchor distT="0" distB="0" distL="114300" distR="114300" simplePos="0" relativeHeight="251682816" behindDoc="0" locked="0" layoutInCell="1" allowOverlap="1" wp14:anchorId="47206811" wp14:editId="6936121F">
+                <wp:simplePos x="0" y="0"/>
+                <wp:positionH relativeFrom="column">
+                  <wp:posOffset>2470150</wp:posOffset>
+                </wp:positionH>
+                <wp:positionV relativeFrom="paragraph">
+                  <wp:posOffset>1022985</wp:posOffset>
+                </wp:positionV>
+                <wp:extent cx="2928620" cy="2112010"/>
+                <wp:effectExtent l="0" t="0" r="5080" b="2540"/>
+                <wp:wrapSquare wrapText="bothSides"/>
+                <wp:docPr id="893772709" name="Gruppieren 13" descr="Screenshot in Prisma Studio von meiner Datenbank. Man sieht noch keinen Inhalt in der Datenbank, da ich diese erst gerade eingebunden habe."/>
+                <wp:cNvGraphicFramePr/>
+                <a:graphic xmlns:a="http://schemas.openxmlformats.org/drawingml/2006/main">
+                  <a:graphicData uri="http://schemas.microsoft.com/office/word/2010/wordprocessingGroup">
+                    <wpg:wgp>
+                      <wpg:cNvGrpSpPr/>
+                      <wpg:grpSpPr>
+                        <a:xfrm>
+                          <a:off x="0" y="0"/>
+                          <a:ext cx="2928620" cy="2112010"/>
+                          <a:chOff x="0" y="0"/>
+                          <a:chExt cx="2928620" cy="2112010"/>
+                        </a:xfrm>
+                      </wpg:grpSpPr>
+                      <pic:pic xmlns:pic="http://schemas.openxmlformats.org/drawingml/2006/picture">
+                        <pic:nvPicPr>
+                          <pic:cNvPr id="2140824377" name="Grafik 11" descr="Screenshot in Prisma Studio von meiner Datenbank"/>
+                          <pic:cNvPicPr>
+                            <a:picLocks noChangeAspect="1"/>
+                          </pic:cNvPicPr>
+                        </pic:nvPicPr>
+                        <pic:blipFill>
+                          <a:blip r:embed="rId15" cstate="print">
+                            <a:extLst>
+                              <a:ext uri="{28A0092B-C50C-407E-A947-70E740481C1C}">
+                                <a14:useLocalDpi xmlns:a14="http://schemas.microsoft.com/office/drawing/2010/main" val="0"/>
+                              </a:ext>
+                            </a:extLst>
+                          </a:blip>
+                          <a:srcRect/>
+                          <a:stretch>
+                            <a:fillRect/>
+                          </a:stretch>
+                        </pic:blipFill>
+                        <pic:spPr bwMode="auto">
+                          <a:xfrm>
+                            <a:off x="0" y="0"/>
+                            <a:ext cx="2928620" cy="1647825"/>
+                          </a:xfrm>
+                          <a:prstGeom prst="rect">
+                            <a:avLst/>
+                          </a:prstGeom>
+                          <a:noFill/>
+                          <a:ln>
+                            <a:noFill/>
+                          </a:ln>
+                        </pic:spPr>
+                      </pic:pic>
+                      <wps:wsp>
+                        <wps:cNvPr id="377308790" name="Textfeld 1"/>
+                        <wps:cNvSpPr txBox="1"/>
+                        <wps:spPr>
+                          <a:xfrm>
+                            <a:off x="0" y="1706245"/>
+                            <a:ext cx="2928620" cy="405765"/>
+                          </a:xfrm>
+                          <a:prstGeom prst="rect">
+                            <a:avLst/>
+                          </a:prstGeom>
+                          <a:solidFill>
+                            <a:prstClr val="white"/>
+                          </a:solidFill>
+                          <a:ln>
+                            <a:noFill/>
+                          </a:ln>
+                        </wps:spPr>
+                        <wps:txbx>
+                          <w:txbxContent>
+                            <w:p>
+                              <w:pPr>
+                                <w:pStyle w:val="Beschriftung"/>
+                                <w:rPr>
+                                  <w:noProof/>
+                                </w:rPr>
+                              </w:pPr>
+                              <w:bookmarkStart w:id="41" w:name="_Toc231902174"/>
+                              <w:bookmarkStart w:id="42" w:name="_Toc231902366"/>
+                              <w:r>
+                                <w:t xml:space="preserve">Abbildung </w:t>
+                              </w:r>
+                              <w:fldSimple w:instr=" SEQ Abbildung \* ARABIC ">
+                                <w:r>
+                                  <w:rPr>
+                                    <w:noProof/>
+                                  </w:rPr>
+                                  <w:t>4</w:t>
+                                </w:r>
+                              </w:fldSimple>
+                              <w:r>
+                                <w:t>: Screenshot in Prisma Studio von meiner Datenbank</w:t>
+                              </w:r>
+                              <w:bookmarkEnd w:id="41"/>
+                              <w:bookmarkEnd w:id="42"/>
+                            </w:p>
+                          </w:txbxContent>
+                        </wps:txbx>
+                        <wps:bodyPr rot="0" spcFirstLastPara="0" vertOverflow="overflow" horzOverflow="overflow" vert="horz" wrap="square" lIns="0" tIns="0" rIns="0" bIns="0" numCol="1" spcCol="0" rtlCol="0" fromWordArt="0" anchor="t" anchorCtr="0" forceAA="0" compatLnSpc="1">
+                          <a:prstTxWarp prst="textNoShape">
+                            <a:avLst/>
+                          </a:prstTxWarp>
+                          <a:spAutoFit/>
+                        </wps:bodyPr>
+                      </wps:wsp>
+                    </wpg:wgp>
+                  </a:graphicData>
+                </a:graphic>
+              </wp:anchor>
+            </w:drawing>
+          </mc:Choice>
+          <mc:Fallback>
+            <w:pict>
+              <v:group w14:anchorId="47206811" id="Gruppieren 13" o:spid="_x0000_s1038" alt="Screenshot in Prisma Studio von meiner Datenbank. Man sieht noch keinen Inhalt in der Datenbank, da ich diese erst gerade eingebunden habe." style="position:absolute;margin-left:194.5pt;margin-top:80.55pt;width:230.6pt;height:166.3pt;z-index:251682816" coordsize="29286,21120" o:gfxdata="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">
+                <v:shape id="Grafik 11" o:spid="_x0000_s1039" type="#_x0000_t75" alt="Screenshot in Prisma Studio von meiner Datenbank" style="position:absolute;width:29286;height:16478;visibility:visible;mso-wrap-style:square" o:gfxdata="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">
+                  <v:imagedata r:id="rId16" o:title="Screenshot in Prisma Studio von meiner Datenbank"/>
+                </v:shape>
+                <v:shape id="_x0000_s1040" type="#_x0000_t202" style="position:absolute;top:17062;width:29286;height:4058;visibility:visible;mso-wrap-style:square;v-text-anchor:top" o:gfxdata="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" stroked="f">
+                  <v:textbox style="mso-fit-shape-to-text:t" inset="0,0,0,0">
+                    <w:txbxContent>
+                      <w:p>
+                        <w:pPr>
+                          <w:pStyle w:val="Beschriftung"/>
+                          <w:rPr>
+                            <w:noProof/>
+                          </w:rPr>
+                        </w:pPr>
+                        <w:bookmarkStart w:id="43" w:name="_Toc231902174"/>
+                        <w:bookmarkStart w:id="44" w:name="_Toc231902366"/>
+                        <w:r>
+                          <w:t xml:space="preserve">Abbildung </w:t>
+                        </w:r>
+                        <w:fldSimple w:instr=" SEQ Abbildung \* ARABIC ">
+                          <w:r>
+                            <w:rPr>
+                              <w:noProof/>
+                            </w:rPr>
+                            <w:t>4</w:t>
+                          </w:r>
+                        </w:fldSimple>
+                        <w:r>
+                          <w:t>: Screenshot in Prisma Studio von meiner Datenbank</w:t>
+                        </w:r>
+                        <w:bookmarkEnd w:id="43"/>
+                        <w:bookmarkEnd w:id="44"/>
+                      </w:p>
+                    </w:txbxContent>
+                  </v:textbox>
+                </v:shape>
+                <w10:wrap type="square"/>
+              </v:group>
+            </w:pict>
+          </mc:Fallback>
+        </mc:AlternateContent>
+      </w:r>
+      <w:r>
+        <w:t xml:space="preserve">Heute habe ich die Datenbank eingerichtet und Prisma als ORM ins Backend integriert. Zuerst habe ich Prisma mit dem Befehl </w:t>
+      </w:r>
+      <w:proofErr w:type="spellStart"/>
+      <w:r>
+        <w:t>npx</w:t>
+      </w:r>
+      <w:proofErr w:type="spellEnd"/>
+      <w:r>
+        <w:t xml:space="preserve"> </w:t>
+      </w:r>
+      <w:proofErr w:type="spellStart"/>
+      <w:r>
+        <w:t>prisma</w:t>
+      </w:r>
+      <w:proofErr w:type="spellEnd"/>
+      <w:r>
+        <w:t xml:space="preserve"> </w:t>
+      </w:r>
+      <w:proofErr w:type="spellStart"/>
+      <w:r>
+        <w:t>init</w:t>
+      </w:r>
+      <w:proofErr w:type="spellEnd"/>
+      <w:r>
+        <w:t xml:space="preserve"> initialisiert, wobei SQLite als Datenbank gewählt wurde. Da ich Prisma Version 7 verwende, musste die Datenbankverbindung nicht in der </w:t>
+      </w:r>
+      <w:proofErr w:type="spellStart"/>
+      <w:r>
+        <w:t>schema.prisma</w:t>
+      </w:r>
+      <w:proofErr w:type="spellEnd"/>
+      <w:r>
+        <w:t xml:space="preserve"> definiert werden, sondern wird über die bereits automatisch generierte </w:t>
+      </w:r>
+      <w:proofErr w:type="spellStart"/>
+      <w:r>
+        <w:t>prisma.config.ts</w:t>
+      </w:r>
+      <w:proofErr w:type="spellEnd"/>
+      <w:r>
+        <w:t xml:space="preserve"> Datei verwaltet. Nach der Anpassung der </w:t>
+      </w:r>
+      <w:proofErr w:type="spellStart"/>
+      <w:r>
+        <w:t>schema.prisma</w:t>
+      </w:r>
+      <w:proofErr w:type="spellEnd"/>
+      <w:r>
+        <w:t xml:space="preserve"> habe ich mit </w:t>
+      </w:r>
+      <w:proofErr w:type="spellStart"/>
+      <w:r>
+        <w:t>npx</w:t>
+      </w:r>
+      <w:proofErr w:type="spellEnd"/>
+      <w:r>
+        <w:t xml:space="preserve"> </w:t>
+      </w:r>
+      <w:proofErr w:type="spellStart"/>
+      <w:r>
+        <w:t>prisma</w:t>
+      </w:r>
+      <w:proofErr w:type="spellEnd"/>
+      <w:r>
+        <w:t xml:space="preserve"> </w:t>
+      </w:r>
+      <w:proofErr w:type="spellStart"/>
+      <w:r>
+        <w:t>migrate</w:t>
+      </w:r>
+      <w:proofErr w:type="spellEnd"/>
+      <w:r>
+        <w:t xml:space="preserve"> </w:t>
+      </w:r>
+      <w:proofErr w:type="spellStart"/>
+      <w:r>
+        <w:t>dev</w:t>
+      </w:r>
+      <w:proofErr w:type="spellEnd"/>
+      <w:r>
+        <w:t xml:space="preserve"> --</w:t>
+      </w:r>
+      <w:proofErr w:type="spellStart"/>
+      <w:r>
+        <w:t>name</w:t>
+      </w:r>
+      <w:proofErr w:type="spellEnd"/>
+      <w:r>
+        <w:t xml:space="preserve"> </w:t>
+      </w:r>
+      <w:proofErr w:type="spellStart"/>
+      <w:r>
+        <w:t>init</w:t>
+      </w:r>
+      <w:proofErr w:type="spellEnd"/>
+      <w:r>
+        <w:t xml:space="preserve"> die Datenbank erstellt. Die Datei </w:t>
+      </w:r>
+      <w:proofErr w:type="spellStart"/>
+      <w:r>
+        <w:t>dev.db</w:t>
+      </w:r>
+      <w:proofErr w:type="spellEnd"/>
+      <w:r>
+        <w:t xml:space="preserve"> wurde dabei automatisch angelegt. Zum Abschluss habe ich Prisma Studio mit </w:t>
+      </w:r>
+      <w:proofErr w:type="spellStart"/>
+      <w:r>
+        <w:t>npx</w:t>
+      </w:r>
+      <w:proofErr w:type="spellEnd"/>
+      <w:r>
+        <w:t xml:space="preserve"> </w:t>
+      </w:r>
+      <w:proofErr w:type="spellStart"/>
+      <w:r>
+        <w:t>prisma</w:t>
+      </w:r>
+      <w:proofErr w:type="spellEnd"/>
+      <w:r>
+        <w:t xml:space="preserve"> </w:t>
+      </w:r>
+      <w:proofErr w:type="spellStart"/>
+      <w:r>
+        <w:t>studio</w:t>
+      </w:r>
+      <w:proofErr w:type="spellEnd"/>
+      <w:r>
+        <w:t xml:space="preserve"> gestartet und konnte die Datenbank erfolgreich im Browser aufrufen.</w:t>
+      </w:r>
+      <w:r>
+        <w:rPr>
+          <w:noProof/>
+        </w:rPr>
+        <w:t xml:space="preserve"> </w:t>
       </w:r>
     </w:p>
     <w:p>
       <w:pPr>
-        <w:pStyle w:val="berschrift2"/>
-      </w:pPr>
-      <w:bookmarkStart w:id="25" w:name="_Toc231370521"/>
-      <w:r>
-        <w:t>3.5 Testplan</w:t>
-      </w:r>
-      <w:bookmarkEnd w:id="25"/>
+        <w:pStyle w:val="berschrift3"/>
+      </w:pPr>
+      <w:r>
+        <w:t>Woche 2</w:t>
+      </w:r>
     </w:p>
     <w:p>
       <w:pPr>
+        <w:pStyle w:val="berschrift4"/>
+      </w:pPr>
+      <w:r>
+        <w:t>Tag 4 – 08.06.2026</w:t>
+      </w:r>
+    </w:p>
+    <w:p>
+      <w:r>
+        <w:rPr>
+          <w:noProof/>
+        </w:rPr>
+        <mc:AlternateContent>
+          <mc:Choice Requires="wpg">
+            <w:drawing>
+              <wp:anchor distT="0" distB="0" distL="114300" distR="114300" simplePos="0" relativeHeight="251685888" behindDoc="0" locked="0" layoutInCell="1" allowOverlap="1" wp14:anchorId="2A293BEB" wp14:editId="5A622054">
+                <wp:simplePos x="0" y="0"/>
+                <wp:positionH relativeFrom="column">
+                  <wp:posOffset>4523178</wp:posOffset>
+                </wp:positionH>
+                <wp:positionV relativeFrom="paragraph">
+                  <wp:posOffset>1090992</wp:posOffset>
+                </wp:positionV>
+                <wp:extent cx="1137285" cy="2746375"/>
+                <wp:effectExtent l="0" t="0" r="5715" b="0"/>
+                <wp:wrapSquare wrapText="bothSides"/>
+                <wp:docPr id="890294716" name="Gruppieren 14" descr="Screenshot des aktuellen Standes der Expo-App. Man sieht eine Seite auf der man ein neues Workout erstellen und benennen kann."/>
+                <wp:cNvGraphicFramePr/>
+                <a:graphic xmlns:a="http://schemas.openxmlformats.org/drawingml/2006/main">
+                  <a:graphicData uri="http://schemas.microsoft.com/office/word/2010/wordprocessingGroup">
+                    <wpg:wgp>
+                      <wpg:cNvGrpSpPr/>
+                      <wpg:grpSpPr>
+                        <a:xfrm>
+                          <a:off x="0" y="0"/>
+                          <a:ext cx="1137285" cy="2746375"/>
+                          <a:chOff x="0" y="0"/>
+                          <a:chExt cx="1137285" cy="2746375"/>
+                        </a:xfrm>
+                      </wpg:grpSpPr>
+                      <pic:pic xmlns:pic="http://schemas.openxmlformats.org/drawingml/2006/picture">
+                        <pic:nvPicPr>
+                          <pic:cNvPr id="2114815094" name="Grafik 12"/>
+                          <pic:cNvPicPr>
+                            <a:picLocks noChangeAspect="1"/>
+                          </pic:cNvPicPr>
+                        </pic:nvPicPr>
+                        <pic:blipFill>
+                          <a:blip r:embed="rId17" cstate="print">
+                            <a:extLst>
+                              <a:ext uri="{28A0092B-C50C-407E-A947-70E740481C1C}">
+                                <a14:useLocalDpi xmlns:a14="http://schemas.microsoft.com/office/drawing/2010/main" val="0"/>
+                              </a:ext>
+                            </a:extLst>
+                          </a:blip>
+                          <a:srcRect/>
+                          <a:stretch>
+                            <a:fillRect/>
+                          </a:stretch>
+                        </pic:blipFill>
+                        <pic:spPr bwMode="auto">
+                          <a:xfrm>
+                            <a:off x="0" y="0"/>
+                            <a:ext cx="1137285" cy="2007870"/>
+                          </a:xfrm>
+                          <a:prstGeom prst="rect">
+                            <a:avLst/>
+                          </a:prstGeom>
+                          <a:noFill/>
+                          <a:ln>
+                            <a:noFill/>
+                          </a:ln>
+                        </pic:spPr>
+                      </pic:pic>
+                      <wps:wsp>
+                        <wps:cNvPr id="2007132500" name="Textfeld 1"/>
+                        <wps:cNvSpPr txBox="1"/>
+                        <wps:spPr>
+                          <a:xfrm>
+                            <a:off x="0" y="2061210"/>
+                            <a:ext cx="1137285" cy="685165"/>
+                          </a:xfrm>
+                          <a:prstGeom prst="rect">
+                            <a:avLst/>
+                          </a:prstGeom>
+                          <a:solidFill>
+                            <a:prstClr val="white"/>
+                          </a:solidFill>
+                          <a:ln>
+                            <a:noFill/>
+                          </a:ln>
+                        </wps:spPr>
+                        <wps:txbx>
+                          <w:txbxContent>
+                            <w:p>
+                              <w:pPr>
+                                <w:pStyle w:val="Beschriftung"/>
+                                <w:rPr>
+                                  <w:noProof/>
+                                </w:rPr>
+                              </w:pPr>
+                              <w:bookmarkStart w:id="45" w:name="_Toc231902175"/>
+                              <w:bookmarkStart w:id="46" w:name="_Toc231902367"/>
+                              <w:r>
+                                <w:t xml:space="preserve">Abbildung </w:t>
+                              </w:r>
+                              <w:fldSimple w:instr=" SEQ Abbildung \* ARABIC ">
+                                <w:r>
+                                  <w:rPr>
+                                    <w:noProof/>
+                                  </w:rPr>
+                                  <w:t>5</w:t>
+                                </w:r>
+                              </w:fldSimple>
+                              <w:r>
+                                <w:t>: Screenshot des aktuellen Standes der Expo-App</w:t>
+                              </w:r>
+                              <w:bookmarkEnd w:id="45"/>
+                              <w:bookmarkEnd w:id="46"/>
+                            </w:p>
+                          </w:txbxContent>
+                        </wps:txbx>
+                        <wps:bodyPr rot="0" spcFirstLastPara="0" vertOverflow="overflow" horzOverflow="overflow" vert="horz" wrap="square" lIns="0" tIns="0" rIns="0" bIns="0" numCol="1" spcCol="0" rtlCol="0" fromWordArt="0" anchor="t" anchorCtr="0" forceAA="0" compatLnSpc="1">
+                          <a:prstTxWarp prst="textNoShape">
+                            <a:avLst/>
+                          </a:prstTxWarp>
+                          <a:spAutoFit/>
+                        </wps:bodyPr>
+                      </wps:wsp>
+                    </wpg:wgp>
+                  </a:graphicData>
+                </a:graphic>
+              </wp:anchor>
+            </w:drawing>
+          </mc:Choice>
+          <mc:Fallback>
+            <w:pict>
+              <v:group w14:anchorId="2A293BEB" id="Gruppieren 14" o:spid="_x0000_s1041" alt="Screenshot des aktuellen Standes der Expo-App. Man sieht eine Seite auf der man ein neues Workout erstellen und benennen kann." style="position:absolute;margin-left:356.15pt;margin-top:85.9pt;width:89.55pt;height:216.25pt;z-index:251685888" coordsize="11372,27463" o:gfxdata="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">
+                <v:shape id="Grafik 12" o:spid="_x0000_s1042" type="#_x0000_t75" style="position:absolute;width:11372;height:20078;visibility:visible;mso-wrap-style:square" o:gfxdata="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">
+                  <v:imagedata r:id="rId18" o:title=""/>
+                </v:shape>
+                <v:shape id="_x0000_s1043" type="#_x0000_t202" style="position:absolute;top:20612;width:11372;height:6851;visibility:visible;mso-wrap-style:square;v-text-anchor:top" o:gfxdata="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" stroked="f">
+                  <v:textbox style="mso-fit-shape-to-text:t" inset="0,0,0,0">
+                    <w:txbxContent>
+                      <w:p>
+                        <w:pPr>
+                          <w:pStyle w:val="Beschriftung"/>
+                          <w:rPr>
+                            <w:noProof/>
+                          </w:rPr>
+                        </w:pPr>
+                        <w:bookmarkStart w:id="47" w:name="_Toc231902175"/>
+                        <w:bookmarkStart w:id="48" w:name="_Toc231902367"/>
+                        <w:r>
+                          <w:t xml:space="preserve">Abbildung </w:t>
+                        </w:r>
+                        <w:fldSimple w:instr=" SEQ Abbildung \* ARABIC ">
+                          <w:r>
+                            <w:rPr>
+                              <w:noProof/>
+                            </w:rPr>
+                            <w:t>5</w:t>
+                          </w:r>
+                        </w:fldSimple>
+                        <w:r>
+                          <w:t>: Screenshot des aktuellen Standes der Expo-App</w:t>
+                        </w:r>
+                        <w:bookmarkEnd w:id="47"/>
+                        <w:bookmarkEnd w:id="48"/>
+                      </w:p>
+                    </w:txbxContent>
+                  </v:textbox>
+                </v:shape>
+                <w10:wrap type="square"/>
+              </v:group>
+            </w:pict>
+          </mc:Fallback>
+        </mc:AlternateContent>
+      </w:r>
+      <w:r>
+        <w:t>Heute habe ich das Datenmodell für die App im Prisma-Schema definiert. Da die Datenbankverbindung und die ORM-Integration bereits in den letzten Tagen erfolgreich abgeschlossen wurden, konnte ich heute direkt mit der Modellierung der eigentlichen Datenstruktur beginnen. Als erstes habe ich das Workout-Modell erstellt (</w:t>
+      </w:r>
+      <w:proofErr w:type="spellStart"/>
+      <w:r>
+        <w:t>Issue</w:t>
+      </w:r>
+      <w:proofErr w:type="spellEnd"/>
+      <w:r>
+        <w:t xml:space="preserve"> #7). Ein Workout enthält einen Namen sowie ein Erstellungsdatum und dient als übergeordnete Einheit, der alle Übungen zugeordnet werden. Anschliessend habe ich die Modelle für </w:t>
+      </w:r>
+      <w:proofErr w:type="spellStart"/>
+      <w:r>
+        <w:t>Exercise</w:t>
+      </w:r>
+      <w:proofErr w:type="spellEnd"/>
+      <w:r>
+        <w:t xml:space="preserve"> und Set ergänzt (</w:t>
+      </w:r>
+      <w:proofErr w:type="spellStart"/>
+      <w:r>
+        <w:t>Issue</w:t>
+      </w:r>
+      <w:proofErr w:type="spellEnd"/>
+      <w:r>
+        <w:t xml:space="preserve"> #8). Eine </w:t>
+      </w:r>
+      <w:proofErr w:type="spellStart"/>
+      <w:r>
+        <w:t>Exercise</w:t>
+      </w:r>
+      <w:proofErr w:type="spellEnd"/>
+      <w:r>
+        <w:t xml:space="preserve"> (Übung) ist immer einem bestimmten Workout zugeordnet und enthält den Namen der Übung. Ein Set gehört zu einer </w:t>
+      </w:r>
+      <w:proofErr w:type="spellStart"/>
+      <w:r>
+        <w:t>Exercise</w:t>
+      </w:r>
+      <w:proofErr w:type="spellEnd"/>
+      <w:r>
+        <w:t xml:space="preserve"> und speichert das verwendete Gewicht in Kilogramm sowie die Anzahl der Wiederholungen. Diese Beziehungen (Relations) habe ich korrekt mit Prisma-Fremdschlüsseln abgebildet, sodass die Verknüpfungen zwischen den Tabellen in der Datenbank automatisch erzeugt werden. Nach der Modelldefinition habe ich eine neue Prisma-Migration erstellt und ausgeführt. Prisma Studio hat mir bestätigt, dass alle drei Tabellen – Workout, </w:t>
+      </w:r>
+      <w:proofErr w:type="spellStart"/>
+      <w:r>
+        <w:t>Exercise</w:t>
+      </w:r>
+      <w:proofErr w:type="spellEnd"/>
+      <w:r>
+        <w:t xml:space="preserve"> und </w:t>
+      </w:r>
+      <w:r>
+        <w:lastRenderedPageBreak/>
+        <w:t>Set – korrekt in der Datenbank angelegt wurden und die Relations wie erwartet funktionieren. Damit ist Milestone 1 vollständig abgeschlossen. Die gesamte Grundlage – Projektsetup, Navigation, Backend, Datenbankanbindung und Datenmodell – ist bereit für die Umsetzung des eigentlichen Workout-Trackings in Milestone 2.</w:t>
+      </w:r>
+      <w:r>
+        <w:rPr>
+          <w:noProof/>
+        </w:rPr>
+        <w:t xml:space="preserve"> </w:t>
+      </w:r>
+    </w:p>
+    <w:p>
+      <w:pPr>
+        <w:pStyle w:val="berschrift4"/>
+      </w:pPr>
+      <w:r>
+        <w:t>Tag 5 – 09.06.2026</w:t>
+      </w:r>
+    </w:p>
+    <w:p>
+      <w:r>
+        <w:rPr>
+          <w:noProof/>
+        </w:rPr>
+        <mc:AlternateContent>
+          <mc:Choice Requires="wpg">
+            <w:drawing>
+              <wp:anchor distT="0" distB="0" distL="114300" distR="114300" simplePos="0" relativeHeight="251688960" behindDoc="0" locked="0" layoutInCell="1" allowOverlap="1" wp14:anchorId="3DF41B56" wp14:editId="0007A442">
+                <wp:simplePos x="0" y="0"/>
+                <wp:positionH relativeFrom="column">
+                  <wp:posOffset>-1252</wp:posOffset>
+                </wp:positionH>
+                <wp:positionV relativeFrom="paragraph">
+                  <wp:posOffset>842539</wp:posOffset>
+                </wp:positionV>
+                <wp:extent cx="5760720" cy="916306"/>
+                <wp:effectExtent l="0" t="0" r="0" b="0"/>
+                <wp:wrapSquare wrapText="bothSides"/>
+                <wp:docPr id="475888842" name="Gruppieren 16"/>
+                <wp:cNvGraphicFramePr/>
+                <a:graphic xmlns:a="http://schemas.openxmlformats.org/drawingml/2006/main">
+                  <a:graphicData uri="http://schemas.microsoft.com/office/word/2010/wordprocessingGroup">
+                    <wpg:wgp>
+                      <wpg:cNvGrpSpPr/>
+                      <wpg:grpSpPr>
+                        <a:xfrm>
+                          <a:off x="0" y="0"/>
+                          <a:ext cx="5760720" cy="916306"/>
+                          <a:chOff x="0" y="0"/>
+                          <a:chExt cx="5760720" cy="916306"/>
+                        </a:xfrm>
+                      </wpg:grpSpPr>
+                      <pic:pic xmlns:pic="http://schemas.openxmlformats.org/drawingml/2006/picture">
+                        <pic:nvPicPr>
+                          <pic:cNvPr id="371498070" name="Grafik 1"/>
+                          <pic:cNvPicPr>
+                            <a:picLocks noChangeAspect="1"/>
+                          </pic:cNvPicPr>
+                        </pic:nvPicPr>
+                        <pic:blipFill>
+                          <a:blip r:embed="rId19"/>
+                          <a:stretch>
+                            <a:fillRect/>
+                          </a:stretch>
+                        </pic:blipFill>
+                        <pic:spPr>
+                          <a:xfrm>
+                            <a:off x="0" y="0"/>
+                            <a:ext cx="5760720" cy="591185"/>
+                          </a:xfrm>
+                          <a:prstGeom prst="rect">
+                            <a:avLst/>
+                          </a:prstGeom>
+                        </pic:spPr>
+                      </pic:pic>
+                      <wps:wsp>
+                        <wps:cNvPr id="348326644" name="Textfeld 1"/>
+                        <wps:cNvSpPr txBox="1"/>
+                        <wps:spPr>
+                          <a:xfrm>
+                            <a:off x="0" y="649606"/>
+                            <a:ext cx="5760720" cy="266700"/>
+                          </a:xfrm>
+                          <a:prstGeom prst="rect">
+                            <a:avLst/>
+                          </a:prstGeom>
+                          <a:solidFill>
+                            <a:prstClr val="white"/>
+                          </a:solidFill>
+                          <a:ln>
+                            <a:noFill/>
+                          </a:ln>
+                        </wps:spPr>
+                        <wps:txbx>
+                          <w:txbxContent>
+                            <w:p>
+                              <w:pPr>
+                                <w:pStyle w:val="Beschriftung"/>
+                                <w:rPr>
+                                  <w:rFonts w:asciiTheme="majorHAnsi" w:hAnsiTheme="majorHAnsi"/>
+                                </w:rPr>
+                              </w:pPr>
+                              <w:bookmarkStart w:id="49" w:name="_Toc231902176"/>
+                              <w:bookmarkStart w:id="50" w:name="_Toc231902368"/>
+                              <w:r>
+                                <w:rPr>
+                                  <w:rFonts w:asciiTheme="majorHAnsi" w:hAnsiTheme="majorHAnsi"/>
+                                </w:rPr>
+                                <w:t xml:space="preserve">Abbildung </w:t>
+                              </w:r>
+                              <w:r>
+                                <w:rPr>
+                                  <w:rFonts w:asciiTheme="majorHAnsi" w:hAnsiTheme="majorHAnsi"/>
+                                </w:rPr>
+                                <w:fldChar w:fldCharType="begin"/>
+                              </w:r>
+                              <w:r>
+                                <w:rPr>
+                                  <w:rFonts w:asciiTheme="majorHAnsi" w:hAnsiTheme="majorHAnsi"/>
+                                </w:rPr>
+                                <w:instrText xml:space="preserve"> SEQ Abbildung \* ARABIC </w:instrText>
+                              </w:r>
+                              <w:r>
+                                <w:rPr>
+                                  <w:rFonts w:asciiTheme="majorHAnsi" w:hAnsiTheme="majorHAnsi"/>
+                                </w:rPr>
+                                <w:fldChar w:fldCharType="separate"/>
+                              </w:r>
+                              <w:r>
+                                <w:rPr>
+                                  <w:rFonts w:asciiTheme="majorHAnsi" w:hAnsiTheme="majorHAnsi"/>
+                                  <w:noProof/>
+                                </w:rPr>
+                                <w:t>6</w:t>
+                              </w:r>
+                              <w:r>
+                                <w:rPr>
+                                  <w:rFonts w:asciiTheme="majorHAnsi" w:hAnsiTheme="majorHAnsi"/>
+                                </w:rPr>
+                                <w:fldChar w:fldCharType="end"/>
+                              </w:r>
+                              <w:r>
+                                <w:rPr>
+                                  <w:rFonts w:asciiTheme="majorHAnsi" w:hAnsiTheme="majorHAnsi"/>
+                                </w:rPr>
+                                <w:t xml:space="preserve">: </w:t>
+                              </w:r>
+                              <w:r>
+                                <w:rPr>
+                                  <w:rFonts w:asciiTheme="majorHAnsi" w:hAnsiTheme="majorHAnsi"/>
+                                </w:rPr>
+                                <w:t>Screenshot des ersten Eintrags in der Datenbank in Prisma Studio</w:t>
+                              </w:r>
+                              <w:bookmarkEnd w:id="49"/>
+                              <w:bookmarkEnd w:id="50"/>
+                            </w:p>
+                          </w:txbxContent>
+                        </wps:txbx>
+                        <wps:bodyPr rot="0" spcFirstLastPara="0" vertOverflow="overflow" horzOverflow="overflow" vert="horz" wrap="square" lIns="0" tIns="0" rIns="0" bIns="0" numCol="1" spcCol="0" rtlCol="0" fromWordArt="0" anchor="t" anchorCtr="0" forceAA="0" compatLnSpc="1">
+                          <a:prstTxWarp prst="textNoShape">
+                            <a:avLst/>
+                          </a:prstTxWarp>
+                          <a:spAutoFit/>
+                        </wps:bodyPr>
+                      </wps:wsp>
+                    </wpg:wgp>
+                  </a:graphicData>
+                </a:graphic>
+              </wp:anchor>
+            </w:drawing>
+          </mc:Choice>
+          <mc:Fallback>
+            <w:pict>
+              <v:group w14:anchorId="3DF41B56" id="Gruppieren 16" o:spid="_x0000_s1044" style="position:absolute;margin-left:-.1pt;margin-top:66.35pt;width:453.6pt;height:72.15pt;z-index:251688960" coordsize="57607,9163" o:gfxdata="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">
+                <v:shape id="Grafik 1" o:spid="_x0000_s1045" type="#_x0000_t75" style="position:absolute;width:57607;height:5911;visibility:visible;mso-wrap-style:square" o:gfxdata="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">
+                  <v:imagedata r:id="rId20" o:title=""/>
+                </v:shape>
+                <v:shape id="_x0000_s1046" type="#_x0000_t202" style="position:absolute;top:6496;width:57607;height:2667;visibility:visible;mso-wrap-style:square;v-text-anchor:top" o:gfxdata="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" stroked="f">
+                  <v:textbox style="mso-fit-shape-to-text:t" inset="0,0,0,0">
+                    <w:txbxContent>
+                      <w:p>
+                        <w:pPr>
+                          <w:pStyle w:val="Beschriftung"/>
+                          <w:rPr>
+                            <w:rFonts w:asciiTheme="majorHAnsi" w:hAnsiTheme="majorHAnsi"/>
+                          </w:rPr>
+                        </w:pPr>
+                        <w:bookmarkStart w:id="51" w:name="_Toc231902176"/>
+                        <w:bookmarkStart w:id="52" w:name="_Toc231902368"/>
+                        <w:r>
+                          <w:rPr>
+                            <w:rFonts w:asciiTheme="majorHAnsi" w:hAnsiTheme="majorHAnsi"/>
+                          </w:rPr>
+                          <w:t xml:space="preserve">Abbildung </w:t>
+                        </w:r>
+                        <w:r>
+                          <w:rPr>
+                            <w:rFonts w:asciiTheme="majorHAnsi" w:hAnsiTheme="majorHAnsi"/>
+                          </w:rPr>
+                          <w:fldChar w:fldCharType="begin"/>
+                        </w:r>
+                        <w:r>
+                          <w:rPr>
+                            <w:rFonts w:asciiTheme="majorHAnsi" w:hAnsiTheme="majorHAnsi"/>
+                          </w:rPr>
+                          <w:instrText xml:space="preserve"> SEQ Abbildung \* ARABIC </w:instrText>
+                        </w:r>
+                        <w:r>
+                          <w:rPr>
+                            <w:rFonts w:asciiTheme="majorHAnsi" w:hAnsiTheme="majorHAnsi"/>
+                          </w:rPr>
+                          <w:fldChar w:fldCharType="separate"/>
+                        </w:r>
+                        <w:r>
+                          <w:rPr>
+                            <w:rFonts w:asciiTheme="majorHAnsi" w:hAnsiTheme="majorHAnsi"/>
+                            <w:noProof/>
+                          </w:rPr>
+                          <w:t>6</w:t>
+                        </w:r>
+                        <w:r>
+                          <w:rPr>
+                            <w:rFonts w:asciiTheme="majorHAnsi" w:hAnsiTheme="majorHAnsi"/>
+                          </w:rPr>
+                          <w:fldChar w:fldCharType="end"/>
+                        </w:r>
+                        <w:r>
+                          <w:rPr>
+                            <w:rFonts w:asciiTheme="majorHAnsi" w:hAnsiTheme="majorHAnsi"/>
+                          </w:rPr>
+                          <w:t xml:space="preserve">: </w:t>
+                        </w:r>
+                        <w:r>
+                          <w:rPr>
+                            <w:rFonts w:asciiTheme="majorHAnsi" w:hAnsiTheme="majorHAnsi"/>
+                          </w:rPr>
+                          <w:t>Screenshot des ersten Eintrags in der Datenbank in Prisma Studio</w:t>
+                        </w:r>
+                        <w:bookmarkEnd w:id="51"/>
+                        <w:bookmarkEnd w:id="52"/>
+                      </w:p>
+                    </w:txbxContent>
+                  </v:textbox>
+                </v:shape>
+                <w10:wrap type="square"/>
+              </v:group>
+            </w:pict>
+          </mc:Fallback>
+        </mc:AlternateContent>
+      </w:r>
+      <w:r>
+        <w:t xml:space="preserve">Heute habe ich die ersten zwei </w:t>
+      </w:r>
+      <w:proofErr w:type="spellStart"/>
+      <w:r>
+        <w:t>Issues</w:t>
+      </w:r>
+      <w:proofErr w:type="spellEnd"/>
+      <w:r>
+        <w:t xml:space="preserve"> von Milestone 2 umgesetzt. In </w:t>
+      </w:r>
+      <w:proofErr w:type="spellStart"/>
+      <w:r>
+        <w:t>Issue</w:t>
+      </w:r>
+      <w:proofErr w:type="spellEnd"/>
+      <w:r>
+        <w:t xml:space="preserve"> #9 habe ich den WorkoutScreen.js von einem </w:t>
+      </w:r>
+      <w:proofErr w:type="spellStart"/>
+      <w:r>
+        <w:t>Placeholder</w:t>
+      </w:r>
+      <w:proofErr w:type="spellEnd"/>
+      <w:r>
+        <w:t xml:space="preserve"> zu einem funktionalen Screen ausgebaut. Der Nutzer kann einen Workout-Namen eingeben und über einen Speichern-Button absenden. Die Eingabe wird validiert – bei leerem Feld erscheint eine Fehlermeldung. </w:t>
+      </w:r>
+    </w:p>
+    <w:p>
+      <w:r>
+        <w:t xml:space="preserve">In </w:t>
+      </w:r>
+      <w:proofErr w:type="spellStart"/>
+      <w:r>
+        <w:t>Issue</w:t>
+      </w:r>
+      <w:proofErr w:type="spellEnd"/>
+      <w:r>
+        <w:t xml:space="preserve"> #10 habe ich den POST-</w:t>
+      </w:r>
+      <w:proofErr w:type="spellStart"/>
+      <w:r>
+        <w:t>Endpoint</w:t>
+      </w:r>
+      <w:proofErr w:type="spellEnd"/>
+      <w:r>
+        <w:t xml:space="preserve"> /</w:t>
+      </w:r>
+      <w:proofErr w:type="spellStart"/>
+      <w:r>
+        <w:t>workouts</w:t>
+      </w:r>
+      <w:proofErr w:type="spellEnd"/>
+      <w:r>
+        <w:t xml:space="preserve"> im Backend implementiert und den Screen damit verbunden. Da Prisma 7 einen Driver Adapter benötigt und dieser sich als instabil erwies, habe ich die Datenbankanbindung direkt mit better-sqlite3 umgesetzt. Das Prisma-Schema und die Migrationen bleiben weiterhin für die Datenbankstruktur zuständig. Ein Problem war der Datenbankpfad</w:t>
+      </w:r>
+      <w:r>
+        <w:t xml:space="preserve">, </w:t>
+      </w:r>
+      <w:r>
+        <w:t xml:space="preserve">da </w:t>
+      </w:r>
+      <w:proofErr w:type="spellStart"/>
+      <w:r>
+        <w:t>nodemon</w:t>
+      </w:r>
+      <w:proofErr w:type="spellEnd"/>
+      <w:r>
+        <w:t xml:space="preserve"> das </w:t>
+      </w:r>
+      <w:proofErr w:type="spellStart"/>
+      <w:r>
+        <w:t>Script</w:t>
+      </w:r>
+      <w:proofErr w:type="spellEnd"/>
+      <w:r>
+        <w:t xml:space="preserve"> aus backend/ startet, index.js aber unter backend/</w:t>
+      </w:r>
+      <w:proofErr w:type="spellStart"/>
+      <w:r>
+        <w:t>src</w:t>
+      </w:r>
+      <w:proofErr w:type="spellEnd"/>
+      <w:r>
+        <w:t xml:space="preserve">/ liegt, musste der Pfad mit import.meta.url und </w:t>
+      </w:r>
+      <w:proofErr w:type="spellStart"/>
+      <w:r>
+        <w:t>path.join</w:t>
+      </w:r>
+      <w:proofErr w:type="spellEnd"/>
+      <w:r>
+        <w:t xml:space="preserve"> absolut aufgelöst werden. Nach dieser Korrektur wurde das erste Workout erfolgreich gespeichert und in Prisma Studio verifiziert.</w:t>
+      </w:r>
+      <w:r>
+        <w:rPr>
+          <w:noProof/>
+        </w:rPr>
+        <w:t xml:space="preserve"> </w:t>
+      </w:r>
+    </w:p>
+    <w:p>
+      <w:pPr>
+        <w:pStyle w:val="berschrift2"/>
+      </w:pPr>
+      <w:bookmarkStart w:id="53" w:name="_Toc231370521"/>
+      <w:r>
+        <w:t>3.5 Testplan</w:t>
+      </w:r>
+      <w:bookmarkEnd w:id="53"/>
+    </w:p>
+    <w:p>
+      <w:pPr>
         <w:pStyle w:val="berschrift1"/>
       </w:pPr>
-      <w:bookmarkStart w:id="26" w:name="_Toc231370522"/>
+      <w:bookmarkStart w:id="54" w:name="_Toc231370522"/>
       <w:r>
         <w:lastRenderedPageBreak/>
         <w:t>4. Zusätzliches</w:t>
       </w:r>
-      <w:bookmarkEnd w:id="26"/>
+      <w:bookmarkEnd w:id="54"/>
     </w:p>
     <w:p>
       <w:pPr>
         <w:pStyle w:val="berschrift2"/>
       </w:pPr>
-      <w:bookmarkStart w:id="27" w:name="_Toc231370523"/>
+      <w:bookmarkStart w:id="55" w:name="_Toc231370523"/>
       <w:r>
         <w:t xml:space="preserve">4.1 </w:t>
       </w:r>
-      <w:bookmarkEnd w:id="27"/>
+      <w:bookmarkEnd w:id="55"/>
       <w:r>
         <w:t>Abbildungsverzeichnis</w:t>
       </w:r>
@@ -4582,7 +5778,7 @@
       <w:r>
         <w:fldChar w:fldCharType="separate"/>
       </w:r>
-      <w:hyperlink w:anchor="_Toc231378931" w:history="1">
+      <w:hyperlink w:anchor="_Toc231902364" w:history="1">
         <w:r>
           <w:rPr>
             <w:rStyle w:val="Hyperlink"/>
@@ -4609,7 +5805,7 @@
             <w:noProof/>
             <w:webHidden/>
           </w:rPr>
-          <w:instrText xml:space="preserve"> PAGEREF _Toc231378931 \h </w:instrText>
+          <w:instrText xml:space="preserve"> PAGEREF _Toc231902364 \h </w:instrText>
         </w:r>
         <w:r>
           <w:rPr>
@@ -4652,13 +5848,13 @@
           <w:lang w:eastAsia="de-CH"/>
         </w:rPr>
       </w:pPr>
-      <w:hyperlink w:anchor="_Toc231378932" w:history="1">
+      <w:hyperlink w:anchor="_Toc231902365" w:history="1">
         <w:r>
           <w:rPr>
             <w:rStyle w:val="Hyperlink"/>
             <w:noProof/>
           </w:rPr>
-          <w:t>Abbildung 2: Screenshot des aktuellen Stands der Expo-App</w:t>
+          <w:t>Abbildung 2: Screenshot des aktuellen Stands der Expo-AppAbbildung 3: Screenshot des aktuellen Stands der Expo-App</w:t>
         </w:r>
         <w:r>
           <w:rPr>
@@ -4679,7 +5875,7 @@
             <w:noProof/>
             <w:webHidden/>
           </w:rPr>
-          <w:instrText xml:space="preserve"> PAGEREF _Toc231378932 \h </w:instrText>
+          <w:instrText xml:space="preserve"> PAGEREF _Toc231902365 \h </w:instrText>
         </w:r>
         <w:r>
           <w:rPr>
@@ -4722,13 +5918,13 @@
           <w:lang w:eastAsia="de-CH"/>
         </w:rPr>
       </w:pPr>
-      <w:hyperlink w:anchor="_Toc231378933" w:history="1">
+      <w:hyperlink w:anchor="_Toc231902366" w:history="1">
         <w:r>
           <w:rPr>
             <w:rStyle w:val="Hyperlink"/>
             <w:noProof/>
           </w:rPr>
-          <w:t>Abbildung 3: Screenshot des aktuellen Stands der Expo-App</w:t>
+          <w:t>Abbildung 4: Screenshot in Prisma Studio von meiner Datenbank</w:t>
         </w:r>
         <w:r>
           <w:rPr>
@@ -4749,7 +5945,7 @@
             <w:noProof/>
             <w:webHidden/>
           </w:rPr>
-          <w:instrText xml:space="preserve"> PAGEREF _Toc231378933 \h </w:instrText>
+          <w:instrText xml:space="preserve"> PAGEREF _Toc231902366 \h </w:instrText>
         </w:r>
         <w:r>
           <w:rPr>
@@ -4769,7 +5965,7 @@
             <w:noProof/>
             <w:webHidden/>
           </w:rPr>
-          <w:t>6</w:t>
+          <w:t>7</w:t>
         </w:r>
         <w:r>
           <w:rPr>
@@ -4781,24 +5977,165 @@
       </w:hyperlink>
     </w:p>
     <w:p>
-      <w:r>
-        <w:fldChar w:fldCharType="end"/>
-      </w:r>
+      <w:pPr>
+        <w:pStyle w:val="Abbildungsverzeichnis"/>
+        <w:tabs>
+          <w:tab w:val="right" w:leader="dot" w:pos="9062"/>
+        </w:tabs>
+        <w:rPr>
+          <w:rFonts w:eastAsiaTheme="minorEastAsia"/>
+          <w:noProof/>
+          <w:lang w:eastAsia="de-CH"/>
+        </w:rPr>
+      </w:pPr>
+      <w:hyperlink w:anchor="_Toc231902367" w:history="1">
+        <w:r>
+          <w:rPr>
+            <w:rStyle w:val="Hyperlink"/>
+            <w:noProof/>
+          </w:rPr>
+          <w:t>Abbildung 5: Screenshot des aktuellen Standes der Expo-App</w:t>
+        </w:r>
+        <w:r>
+          <w:rPr>
+            <w:noProof/>
+            <w:webHidden/>
+          </w:rPr>
+          <w:tab/>
+        </w:r>
+        <w:r>
+          <w:rPr>
+            <w:noProof/>
+            <w:webHidden/>
+          </w:rPr>
+          <w:fldChar w:fldCharType="begin"/>
+        </w:r>
+        <w:r>
+          <w:rPr>
+            <w:noProof/>
+            <w:webHidden/>
+          </w:rPr>
+          <w:instrText xml:space="preserve"> PAGEREF _Toc231902367 \h </w:instrText>
+        </w:r>
+        <w:r>
+          <w:rPr>
+            <w:noProof/>
+            <w:webHidden/>
+          </w:rPr>
+        </w:r>
+        <w:r>
+          <w:rPr>
+            <w:noProof/>
+            <w:webHidden/>
+          </w:rPr>
+          <w:fldChar w:fldCharType="separate"/>
+        </w:r>
+        <w:r>
+          <w:rPr>
+            <w:noProof/>
+            <w:webHidden/>
+          </w:rPr>
+          <w:t>7</w:t>
+        </w:r>
+        <w:r>
+          <w:rPr>
+            <w:noProof/>
+            <w:webHidden/>
+          </w:rPr>
+          <w:fldChar w:fldCharType="end"/>
+        </w:r>
+      </w:hyperlink>
     </w:p>
     <w:p>
       <w:pPr>
+        <w:pStyle w:val="Abbildungsverzeichnis"/>
+        <w:tabs>
+          <w:tab w:val="right" w:leader="dot" w:pos="9062"/>
+        </w:tabs>
+        <w:rPr>
+          <w:rFonts w:eastAsiaTheme="minorEastAsia"/>
+          <w:noProof/>
+          <w:lang w:eastAsia="de-CH"/>
+        </w:rPr>
+      </w:pPr>
+      <w:hyperlink w:anchor="_Toc231902368" w:history="1">
+        <w:r>
+          <w:rPr>
+            <w:rStyle w:val="Hyperlink"/>
+            <w:rFonts w:asciiTheme="majorHAnsi" w:hAnsiTheme="majorHAnsi"/>
+            <w:noProof/>
+          </w:rPr>
+          <w:t>Abbildung 6: Screenshot des ersten Eintrags in der Datenbank in Prisma Studio</w:t>
+        </w:r>
+        <w:r>
+          <w:rPr>
+            <w:noProof/>
+            <w:webHidden/>
+          </w:rPr>
+          <w:tab/>
+        </w:r>
+        <w:r>
+          <w:rPr>
+            <w:noProof/>
+            <w:webHidden/>
+          </w:rPr>
+          <w:fldChar w:fldCharType="begin"/>
+        </w:r>
+        <w:r>
+          <w:rPr>
+            <w:noProof/>
+            <w:webHidden/>
+          </w:rPr>
+          <w:instrText xml:space="preserve"> PAGEREF _Toc231902368 \h </w:instrText>
+        </w:r>
+        <w:r>
+          <w:rPr>
+            <w:noProof/>
+            <w:webHidden/>
+          </w:rPr>
+        </w:r>
+        <w:r>
+          <w:rPr>
+            <w:noProof/>
+            <w:webHidden/>
+          </w:rPr>
+          <w:fldChar w:fldCharType="separate"/>
+        </w:r>
+        <w:r>
+          <w:rPr>
+            <w:noProof/>
+            <w:webHidden/>
+          </w:rPr>
+          <w:t>8</w:t>
+        </w:r>
+        <w:r>
+          <w:rPr>
+            <w:noProof/>
+            <w:webHidden/>
+          </w:rPr>
+          <w:fldChar w:fldCharType="end"/>
+        </w:r>
+      </w:hyperlink>
+    </w:p>
+    <w:p>
+      <w:r>
+        <w:fldChar w:fldCharType="end"/>
+      </w:r>
+    </w:p>
+    <w:p>
+      <w:pPr>
         <w:pStyle w:val="berschrift2"/>
       </w:pPr>
-      <w:bookmarkStart w:id="28" w:name="_Toc231370524"/>
+      <w:bookmarkStart w:id="56" w:name="_Toc231370524"/>
       <w:r>
         <w:t>4.2 Quellenverzeichnis</w:t>
       </w:r>
-      <w:bookmarkEnd w:id="28"/>
+      <w:bookmarkEnd w:id="56"/>
     </w:p>
     <w:sectPr>
-      <w:headerReference w:type="default" r:id="rId15"/>
-      <w:footerReference w:type="default" r:id="rId16"/>
-      <w:headerReference w:type="first" r:id="rId17"/>
+      <w:headerReference w:type="default" r:id="rId21"/>
+      <w:footerReference w:type="default" r:id="rId22"/>
+      <w:headerReference w:type="first" r:id="rId23"/>
       <w:pgSz w:w="11906" w:h="16838"/>
       <w:pgMar w:top="1417" w:right="1417" w:bottom="1134" w:left="1417" w:header="708" w:footer="708" w:gutter="0"/>
       <w:pgNumType w:start="0"/>
@@ -4906,7 +6243,7 @@
               <w:sz w:val="18"/>
               <w:szCs w:val="18"/>
             </w:rPr>
-            <w:t>03.06.2026</w:t>
+            <w:t>09.06.2026</w:t>
           </w:r>
           <w:r>
             <w:rPr>
@@ -5163,7 +6500,7 @@
         </mc:Choice>
         <mc:Fallback>
           <w:pict>
-            <v:rect w14:anchorId="3929D505" id="Rechteck 5" o:spid="_x0000_s1038" style="position:absolute;margin-left:9pt;margin-top:-38.95pt;width:56.7pt;height:25.95pt;z-index:251661312;visibility:visible;mso-wrap-style:square;mso-width-percent:800;mso-height-percent:0;mso-wrap-distance-left:9pt;mso-wrap-distance-top:0;mso-wrap-distance-right:9pt;mso-wrap-distance-bottom:0;mso-position-horizontal:absolute;mso-position-horizontal-relative:left-margin-area;mso-position-vertical:absolute;mso-position-vertical-relative:margin;mso-width-percent:800;mso-height-percent:0;mso-width-relative:left-margin-area;mso-height-relative:page;v-text-anchor:top" o:gfxdata="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" o:allowincell="f" stroked="f">
+            <v:rect w14:anchorId="3929D505" id="Rechteck 5" o:spid="_x0000_s1047" style="position:absolute;margin-left:9pt;margin-top:-38.95pt;width:56.7pt;height:25.95pt;z-index:251661312;visibility:visible;mso-wrap-style:square;mso-width-percent:800;mso-height-percent:0;mso-wrap-distance-left:9pt;mso-wrap-distance-top:0;mso-wrap-distance-right:9pt;mso-wrap-distance-bottom:0;mso-position-horizontal:absolute;mso-position-horizontal-relative:left-margin-area;mso-position-vertical:absolute;mso-position-vertical-relative:margin;mso-width-percent:800;mso-height-percent:0;mso-width-relative:left-margin-area;mso-height-relative:page;v-text-anchor:top" o:gfxdata="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" o:allowincell="f" stroked="f">
               <v:textbox>
                 <w:txbxContent>
                   <w:p>
@@ -5320,7 +6657,7 @@
         </mc:Choice>
         <mc:Fallback>
           <w:pict>
-            <v:rect w14:anchorId="221C99C2" id="Rechteck 182" o:spid="_x0000_s1039" style="position:absolute;margin-left:0;margin-top:0;width:468.5pt;height:21.3pt;z-index:-251657216;visibility:visible;mso-wrap-style:square;mso-width-percent:1000;mso-height-percent:27;mso-top-percent:45;mso-wrap-distance-left:9.35pt;mso-wrap-distance-top:0;mso-wrap-distance-right:9.35pt;mso-wrap-distance-bottom:0;mso-position-horizontal:center;mso-position-horizontal-relative:margin;mso-position-vertical-relative:page;mso-width-percent:1000;mso-height-percent:27;mso-top-percent:45;mso-width-relative:margin;mso-height-relative:page;v-text-anchor:middle" o:gfxdata="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" o:allowoverlap="f" fillcolor="#156082 [3204]" stroked="f" strokeweight="1.5pt">
+            <v:rect w14:anchorId="221C99C2" id="Rechteck 182" o:spid="_x0000_s1048" style="position:absolute;margin-left:0;margin-top:0;width:468.5pt;height:21.3pt;z-index:-251657216;visibility:visible;mso-wrap-style:square;mso-width-percent:1000;mso-height-percent:27;mso-top-percent:45;mso-wrap-distance-left:9.35pt;mso-wrap-distance-top:0;mso-wrap-distance-right:9.35pt;mso-wrap-distance-bottom:0;mso-position-horizontal:center;mso-position-horizontal-relative:margin;mso-position-vertical-relative:page;mso-width-percent:1000;mso-height-percent:27;mso-top-percent:45;mso-width-relative:margin;mso-height-relative:page;v-text-anchor:middle" o:gfxdata="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" o:allowoverlap="f" fillcolor="#156082 [3204]" stroked="f" strokeweight="1.5pt">
               <v:textbox style="mso-fit-shape-to-text:t">
                 <w:txbxContent>
                   <w:sdt>

</xml_diff>